<commit_message>
Refine report into formal academic format
</commit_message>
<xml_diff>
--- a/technical_report.docx
+++ b/technical_report.docx
@@ -4,32 +4,85 @@
   <w:body>
     <w:p>
       <w:pPr>
-        <w:spacing w:after="80"/>
+        <w:spacing w:before="80" w:after="140"/>
+        <w:jc w:val="center"/>
       </w:pPr>
       <w:r>
         <w:rPr>
-          <w:rFonts w:ascii="Calibri" w:hAnsi="Calibri"/>
+          <w:rFonts w:ascii="Times New Roman" w:hAnsi="Times New Roman"/>
           <w:b/>
           <w:i w:val="0"/>
-          <w:color w:val="212529"/>
-          <w:sz w:val="44"/>
+          <w:color w:val="000000"/>
+          <w:sz w:val="32"/>
         </w:rPr>
-        <w:t>Testing ANN and MPS Signals in FinRL</w:t>
+        <w:t>Evaluating ANN and Matrix-Product-State Signals</w:t>
+        <w:br/>
+        <w:t>in a FinRL PPO Agent</w:t>
       </w:r>
     </w:p>
     <w:p>
       <w:pPr>
-        <w:spacing w:after="360"/>
+        <w:spacing w:after="20"/>
+        <w:jc w:val="center"/>
       </w:pPr>
       <w:r>
         <w:rPr>
-          <w:rFonts w:ascii="Calibri" w:hAnsi="Calibri"/>
+          <w:rFonts w:ascii="Times New Roman" w:hAnsi="Times New Roman"/>
           <w:b w:val="0"/>
           <w:i w:val="0"/>
-          <w:color w:val="595959"/>
+          <w:color w:val="000000"/>
           <w:sz w:val="22"/>
         </w:rPr>
-        <w:t>Short technical note | Aarav Nagar | July 2026</w:t>
+        <w:t>Aarav Nagar</w:t>
+      </w:r>
+    </w:p>
+    <w:p>
+      <w:pPr>
+        <w:spacing w:after="280"/>
+        <w:jc w:val="center"/>
+      </w:pPr>
+      <w:r>
+        <w:rPr>
+          <w:rFonts w:ascii="Times New Roman" w:hAnsi="Times New Roman"/>
+          <w:b w:val="0"/>
+          <w:i w:val="0"/>
+          <w:color w:val="000000"/>
+          <w:sz w:val="21"/>
+        </w:rPr>
+        <w:t>July 2026</w:t>
+      </w:r>
+    </w:p>
+    <w:p>
+      <w:pPr>
+        <w:spacing w:after="60"/>
+        <w:jc w:val="center"/>
+      </w:pPr>
+      <w:r>
+        <w:rPr>
+          <w:rFonts w:ascii="Times New Roman" w:hAnsi="Times New Roman"/>
+          <w:b/>
+          <w:i w:val="0"/>
+          <w:color w:val="000000"/>
+          <w:sz w:val="21"/>
+        </w:rPr>
+        <w:t>Abstract</w:t>
+      </w:r>
+    </w:p>
+    <w:p>
+      <w:pPr>
+        <w:spacing w:after="180" w:line="252" w:lineRule="auto"/>
+        <w:ind w:left="432" w:right="432"/>
+        <w:jc w:val="both"/>
+      </w:pPr>
+      <w:r>
+        <w:rPr>
+          <w:rFonts w:ascii="Times New Roman" w:hAnsi="Times New Roman"/>
+          <w:b w:val="0"/>
+          <w:i w:val="0"/>
+          <w:color w:val="000000"/>
+          <w:sz w:val="19"/>
+        </w:rPr>
+        <w:t>This study examines whether a quantum-inspired matrix-product-state (MPS) model provides a more useful trading signal than a conventional artificial neural network (ANN). The two models were matched in parameter count and trained on the same inputs and next-day return target. Their predictions were added separately to the state of a FinRL Proximal Policy Optimization (PPO) agent. The MPS produced slightly lower prediction error and higher directional accuracy, but the ANN-based agent achieved a higher mean out-of-sample Sharpe ratio (0.735 compared with 0.694). MPS trailed ANN in all three paired seeds, and a block-bootstrap confidence interval for the annualized return difference included zero. Under this setup, the MPS signal did not improve trading performance.</w:t>
       </w:r>
     </w:p>
     <w:p>
@@ -37,33 +90,33 @@
         <w:pStyle w:val="Heading1"/>
       </w:pPr>
       <w:r>
-        <w:t>Question</w:t>
+        <w:t>1. Research Question</w:t>
       </w:r>
     </w:p>
     <w:p>
       <w:pPr/>
       <w:r>
         <w:rPr>
-          <w:rFonts w:ascii="Calibri" w:hAnsi="Calibri"/>
+          <w:rFonts w:ascii="Times New Roman" w:hAnsi="Times New Roman"/>
           <w:b w:val="0"/>
           <w:i w:val="0"/>
-          <w:color w:val="212529"/>
-          <w:sz w:val="22"/>
+          <w:color w:val="000000"/>
+          <w:sz w:val="21"/>
         </w:rPr>
-        <w:t>My earlier project found that a quantum-inspired model could perform slightly better than an ANN on some stock-prediction metrics. Professor Liu suggested testing whether that difference still mattered when the prediction became part of an autonomous trading agent.</w:t>
+        <w:t>My earlier project compared quantum-inspired neural networks with hybrid ensemble ANNs for stock-market prediction. One question remained: if one model predicts returns slightly better, will a trading agent actually make better decisions when transaction costs and changing market conditions are included?</w:t>
       </w:r>
     </w:p>
     <w:p>
       <w:pPr/>
       <w:r>
         <w:rPr>
-          <w:rFonts w:ascii="Calibri" w:hAnsi="Calibri"/>
+          <w:rFonts w:ascii="Times New Roman" w:hAnsi="Times New Roman"/>
           <w:b w:val="0"/>
           <w:i w:val="0"/>
-          <w:color w:val="212529"/>
-          <w:sz w:val="22"/>
+          <w:color w:val="000000"/>
+          <w:sz w:val="21"/>
         </w:rPr>
-        <w:t>I asked whether an MPS prediction signal improves FinRL trading performance when the data, model size, PPO setup, transaction costs, and random seeds are held constant.</w:t>
+        <w:t>Following Professor Xiao-Yang Liu's suggestion, I tested the prediction models as state signals inside a FinRL benchmark. The experiment asks whether an MPS signal improves out-of-sample trading performance when the data, parameter count, PPO configuration, costs, and random seeds are held constant.</w:t>
       </w:r>
     </w:p>
     <w:p>
@@ -71,20 +124,85 @@
         <w:pStyle w:val="Heading1"/>
       </w:pPr>
       <w:r>
-        <w:t>Setup</w:t>
+        <w:t>2. Experimental Design</w:t>
+      </w:r>
+    </w:p>
+    <w:p>
+      <w:pPr>
+        <w:pStyle w:val="Heading2"/>
+      </w:pPr>
+      <w:r>
+        <w:t>2.1 Data and time split</w:t>
       </w:r>
     </w:p>
     <w:p>
       <w:pPr/>
       <w:r>
         <w:rPr>
-          <w:rFonts w:ascii="Calibri" w:hAnsi="Calibri"/>
+          <w:rFonts w:ascii="Times New Roman" w:hAnsi="Times New Roman"/>
           <w:b w:val="0"/>
           <w:i w:val="0"/>
-          <w:color w:val="212529"/>
-          <w:sz w:val="22"/>
+          <w:color w:val="000000"/>
+          <w:sz w:val="21"/>
         </w:rPr>
-        <w:t>I used 15 stocks from the processed Nasdaq dataset used in the FinRL Contest 2025 workflow. The prediction models were fit on 2013-2017 data and validated on 2018. PPO was trained on 2013-2018 and tested out of sample on 2019-2023.</w:t>
+        <w:t>The experiment used 15 stocks from the processed Nasdaq dataset associated with the FinRL Contest 2025 workflow: AAPL, AMD, AMGN, AMZN, COST, FANG, GILD, HON, INTC, MSFT, NFLX, NVDA, PEP, SBUX, and XEL.</w:t>
+      </w:r>
+    </w:p>
+    <w:p>
+      <w:pPr/>
+      <w:r>
+        <w:rPr>
+          <w:rFonts w:ascii="Times New Roman" w:hAnsi="Times New Roman"/>
+          <w:b w:val="0"/>
+          <w:i w:val="0"/>
+          <w:color w:val="000000"/>
+          <w:sz w:val="21"/>
+        </w:rPr>
+        <w:t>The ANN and MPS models were fit on 2013-2017 data and validated on 2018. PPO was trained on 2013-2018 and evaluated out of sample on 2019-2023. No test-period return target was used to fit either prediction model or PPO policy. The data were checksum-pinned, and the environment used FinRL commit 2334a5fe6d30629157f13c3b0319e1637e15e123.</w:t>
+      </w:r>
+    </w:p>
+    <w:p>
+      <w:pPr>
+        <w:pStyle w:val="Heading2"/>
+      </w:pPr>
+      <w:r>
+        <w:t>2.2 Prediction models</w:t>
+      </w:r>
+    </w:p>
+    <w:p>
+      <w:pPr/>
+      <w:r>
+        <w:rPr>
+          <w:rFonts w:ascii="Times New Roman" w:hAnsi="Times New Roman"/>
+          <w:b w:val="0"/>
+          <w:i w:val="0"/>
+          <w:color w:val="000000"/>
+          <w:sz w:val="21"/>
+        </w:rPr>
+        <w:t>Both models used the same 13 market features and predicted the same standardized next-day return. The ANN used fully connected layers of 13-16-8-1. The MPS used a trigonometric local feature map and bond dimension 4. Each model contained exactly 369 trainable parameters. The MPS was simulated on classical hardware; no qubits were used.</w:t>
+      </w:r>
+    </w:p>
+    <w:p>
+      <w:pPr>
+        <w:pStyle w:val="Heading2"/>
+      </w:pPr>
+      <w:r>
+        <w:t>2.3 PPO state construction</w:t>
+      </w:r>
+    </w:p>
+    <w:p>
+      <w:pPr>
+        <w:pStyle w:val="Caption"/>
+      </w:pPr>
+      <w:r>
+        <w:rPr>
+          <w:rFonts w:ascii="Times New Roman" w:hAnsi="Times New Roman"/>
+          <w:b w:val="0"/>
+          <w:i/>
+          <w:color w:val="000000"/>
+          <w:sz w:val="19"/>
+        </w:rPr>
+        <w:t>Table 1. State construction for the three PPO conditions</w:t>
       </w:r>
     </w:p>
     <w:tbl>
@@ -94,7 +212,7 @@
         <w:jc w:val="left"/>
         <w:tblLayout w:type="fixed"/>
         <w:tblLook w:firstColumn="1" w:firstRow="1" w:lastColumn="0" w:lastRow="0" w:noHBand="0" w:noVBand="1" w:val="04A0"/>
-        <w:tblInd w:w="120" w:type="dxa"/>
+        <w:tblInd w:w="100" w:type="dxa"/>
       </w:tblPr>
       <w:tblGrid>
         <w:gridCol w:w="1900"/>
@@ -108,12 +226,12 @@
         <w:tc>
           <w:tcPr>
             <w:tcW w:type="dxa" w:w="1900"/>
-            <w:shd w:fill="F2F4F7"/>
+            <w:shd w:fill="E7E6E6"/>
             <w:tcMar>
               <w:top w:w="80" w:type="dxa"/>
               <w:bottom w:w="80" w:type="dxa"/>
-              <w:start w:w="120" w:type="dxa"/>
-              <w:end w:w="120" w:type="dxa"/>
+              <w:start w:w="100" w:type="dxa"/>
+              <w:end w:w="100" w:type="dxa"/>
             </w:tcMar>
             <w:vAlign w:val="center"/>
           </w:tcPr>
@@ -125,11 +243,11 @@
             <w:r/>
             <w:r>
               <w:rPr>
-                <w:rFonts w:ascii="Calibri" w:hAnsi="Calibri"/>
+                <w:rFonts w:ascii="Times New Roman" w:hAnsi="Times New Roman"/>
                 <w:b/>
                 <w:i w:val="0"/>
-                <w:color w:val="212529"/>
-                <w:sz w:val="19"/>
+                <w:color w:val="000000"/>
+                <w:sz w:val="17"/>
               </w:rPr>
               <w:t>Condition</w:t>
             </w:r>
@@ -138,12 +256,12 @@
         <w:tc>
           <w:tcPr>
             <w:tcW w:type="dxa" w:w="6260"/>
-            <w:shd w:fill="F2F4F7"/>
+            <w:shd w:fill="E7E6E6"/>
             <w:tcMar>
               <w:top w:w="80" w:type="dxa"/>
               <w:bottom w:w="80" w:type="dxa"/>
-              <w:start w:w="120" w:type="dxa"/>
-              <w:end w:w="120" w:type="dxa"/>
+              <w:start w:w="100" w:type="dxa"/>
+              <w:end w:w="100" w:type="dxa"/>
             </w:tcMar>
             <w:vAlign w:val="center"/>
           </w:tcPr>
@@ -155,25 +273,25 @@
             <w:r/>
             <w:r>
               <w:rPr>
-                <w:rFonts w:ascii="Calibri" w:hAnsi="Calibri"/>
+                <w:rFonts w:ascii="Times New Roman" w:hAnsi="Times New Roman"/>
                 <w:b/>
                 <w:i w:val="0"/>
-                <w:color w:val="212529"/>
-                <w:sz w:val="19"/>
+                <w:color w:val="000000"/>
+                <w:sz w:val="17"/>
               </w:rPr>
-              <w:t>State given to PPO</w:t>
+              <w:t>State supplied to PPO</w:t>
             </w:r>
           </w:p>
         </w:tc>
         <w:tc>
           <w:tcPr>
             <w:tcW w:type="dxa" w:w="1200"/>
-            <w:shd w:fill="F2F4F7"/>
+            <w:shd w:fill="E7E6E6"/>
             <w:tcMar>
               <w:top w:w="80" w:type="dxa"/>
               <w:bottom w:w="80" w:type="dxa"/>
-              <w:start w:w="120" w:type="dxa"/>
-              <w:end w:w="120" w:type="dxa"/>
+              <w:start w:w="100" w:type="dxa"/>
+              <w:end w:w="100" w:type="dxa"/>
             </w:tcMar>
             <w:vAlign w:val="center"/>
           </w:tcPr>
@@ -185,13 +303,13 @@
             <w:r/>
             <w:r>
               <w:rPr>
-                <w:rFonts w:ascii="Calibri" w:hAnsi="Calibri"/>
+                <w:rFonts w:ascii="Times New Roman" w:hAnsi="Times New Roman"/>
                 <w:b/>
                 <w:i w:val="0"/>
-                <w:color w:val="212529"/>
-                <w:sz w:val="19"/>
+                <w:color w:val="000000"/>
+                <w:sz w:val="17"/>
               </w:rPr>
-              <w:t>Size</w:t>
+              <w:t>Dimension</w:t>
             </w:r>
           </w:p>
         </w:tc>
@@ -203,8 +321,8 @@
             <w:tcMar>
               <w:top w:w="80" w:type="dxa"/>
               <w:bottom w:w="80" w:type="dxa"/>
-              <w:start w:w="120" w:type="dxa"/>
-              <w:end w:w="120" w:type="dxa"/>
+              <w:start w:w="100" w:type="dxa"/>
+              <w:end w:w="100" w:type="dxa"/>
             </w:tcMar>
             <w:vAlign w:val="center"/>
           </w:tcPr>
@@ -216,11 +334,11 @@
             <w:r/>
             <w:r>
               <w:rPr>
-                <w:rFonts w:ascii="Calibri" w:hAnsi="Calibri"/>
+                <w:rFonts w:ascii="Times New Roman" w:hAnsi="Times New Roman"/>
                 <w:b w:val="0"/>
                 <w:i w:val="0"/>
-                <w:color w:val="212529"/>
-                <w:sz w:val="19"/>
+                <w:color w:val="000000"/>
+                <w:sz w:val="17"/>
               </w:rPr>
               <w:t>Base FinRL</w:t>
             </w:r>
@@ -232,8 +350,8 @@
             <w:tcMar>
               <w:top w:w="80" w:type="dxa"/>
               <w:bottom w:w="80" w:type="dxa"/>
-              <w:start w:w="120" w:type="dxa"/>
-              <w:end w:w="120" w:type="dxa"/>
+              <w:start w:w="100" w:type="dxa"/>
+              <w:end w:w="100" w:type="dxa"/>
             </w:tcMar>
             <w:vAlign w:val="center"/>
           </w:tcPr>
@@ -245,11 +363,11 @@
             <w:r/>
             <w:r>
               <w:rPr>
-                <w:rFonts w:ascii="Calibri" w:hAnsi="Calibri"/>
+                <w:rFonts w:ascii="Times New Roman" w:hAnsi="Times New Roman"/>
                 <w:b w:val="0"/>
                 <w:i w:val="0"/>
-                <w:color w:val="212529"/>
-                <w:sz w:val="19"/>
+                <w:color w:val="000000"/>
+                <w:sz w:val="17"/>
               </w:rPr>
               <w:t>Cash, prices, holdings, and 10 indicators per stock</w:t>
             </w:r>
@@ -261,8 +379,8 @@
             <w:tcMar>
               <w:top w:w="80" w:type="dxa"/>
               <w:bottom w:w="80" w:type="dxa"/>
-              <w:start w:w="120" w:type="dxa"/>
-              <w:end w:w="120" w:type="dxa"/>
+              <w:start w:w="100" w:type="dxa"/>
+              <w:end w:w="100" w:type="dxa"/>
             </w:tcMar>
             <w:vAlign w:val="center"/>
           </w:tcPr>
@@ -274,11 +392,11 @@
             <w:r/>
             <w:r>
               <w:rPr>
-                <w:rFonts w:ascii="Calibri" w:hAnsi="Calibri"/>
+                <w:rFonts w:ascii="Times New Roman" w:hAnsi="Times New Roman"/>
                 <w:b w:val="0"/>
                 <w:i w:val="0"/>
-                <w:color w:val="212529"/>
-                <w:sz w:val="19"/>
+                <w:color w:val="000000"/>
+                <w:sz w:val="17"/>
               </w:rPr>
               <w:t>181</w:t>
             </w:r>
@@ -292,8 +410,8 @@
             <w:tcMar>
               <w:top w:w="80" w:type="dxa"/>
               <w:bottom w:w="80" w:type="dxa"/>
-              <w:start w:w="120" w:type="dxa"/>
-              <w:end w:w="120" w:type="dxa"/>
+              <w:start w:w="100" w:type="dxa"/>
+              <w:end w:w="100" w:type="dxa"/>
             </w:tcMar>
             <w:vAlign w:val="center"/>
           </w:tcPr>
@@ -305,11 +423,11 @@
             <w:r/>
             <w:r>
               <w:rPr>
-                <w:rFonts w:ascii="Calibri" w:hAnsi="Calibri"/>
+                <w:rFonts w:ascii="Times New Roman" w:hAnsi="Times New Roman"/>
                 <w:b w:val="0"/>
                 <w:i w:val="0"/>
-                <w:color w:val="212529"/>
-                <w:sz w:val="19"/>
+                <w:color w:val="000000"/>
+                <w:sz w:val="17"/>
               </w:rPr>
               <w:t>ANN signal</w:t>
             </w:r>
@@ -321,8 +439,8 @@
             <w:tcMar>
               <w:top w:w="80" w:type="dxa"/>
               <w:bottom w:w="80" w:type="dxa"/>
-              <w:start w:w="120" w:type="dxa"/>
-              <w:end w:w="120" w:type="dxa"/>
+              <w:start w:w="100" w:type="dxa"/>
+              <w:end w:w="100" w:type="dxa"/>
             </w:tcMar>
             <w:vAlign w:val="center"/>
           </w:tcPr>
@@ -334,13 +452,13 @@
             <w:r/>
             <w:r>
               <w:rPr>
-                <w:rFonts w:ascii="Calibri" w:hAnsi="Calibri"/>
+                <w:rFonts w:ascii="Times New Roman" w:hAnsi="Times New Roman"/>
                 <w:b w:val="0"/>
                 <w:i w:val="0"/>
-                <w:color w:val="212529"/>
-                <w:sz w:val="19"/>
+                <w:color w:val="000000"/>
+                <w:sz w:val="17"/>
               </w:rPr>
-              <w:t>Base state plus one ANN prediction per stock</w:t>
+              <w:t>Base state plus one frozen ANN prediction per stock</w:t>
             </w:r>
           </w:p>
         </w:tc>
@@ -350,8 +468,8 @@
             <w:tcMar>
               <w:top w:w="80" w:type="dxa"/>
               <w:bottom w:w="80" w:type="dxa"/>
-              <w:start w:w="120" w:type="dxa"/>
-              <w:end w:w="120" w:type="dxa"/>
+              <w:start w:w="100" w:type="dxa"/>
+              <w:end w:w="100" w:type="dxa"/>
             </w:tcMar>
             <w:vAlign w:val="center"/>
           </w:tcPr>
@@ -363,11 +481,11 @@
             <w:r/>
             <w:r>
               <w:rPr>
-                <w:rFonts w:ascii="Calibri" w:hAnsi="Calibri"/>
+                <w:rFonts w:ascii="Times New Roman" w:hAnsi="Times New Roman"/>
                 <w:b w:val="0"/>
                 <w:i w:val="0"/>
-                <w:color w:val="212529"/>
-                <w:sz w:val="19"/>
+                <w:color w:val="000000"/>
+                <w:sz w:val="17"/>
               </w:rPr>
               <w:t>196</w:t>
             </w:r>
@@ -381,8 +499,8 @@
             <w:tcMar>
               <w:top w:w="80" w:type="dxa"/>
               <w:bottom w:w="80" w:type="dxa"/>
-              <w:start w:w="120" w:type="dxa"/>
-              <w:end w:w="120" w:type="dxa"/>
+              <w:start w:w="100" w:type="dxa"/>
+              <w:end w:w="100" w:type="dxa"/>
             </w:tcMar>
             <w:vAlign w:val="center"/>
           </w:tcPr>
@@ -394,11 +512,11 @@
             <w:r/>
             <w:r>
               <w:rPr>
-                <w:rFonts w:ascii="Calibri" w:hAnsi="Calibri"/>
+                <w:rFonts w:ascii="Times New Roman" w:hAnsi="Times New Roman"/>
                 <w:b w:val="0"/>
                 <w:i w:val="0"/>
-                <w:color w:val="212529"/>
-                <w:sz w:val="19"/>
+                <w:color w:val="000000"/>
+                <w:sz w:val="17"/>
               </w:rPr>
               <w:t>MPS signal</w:t>
             </w:r>
@@ -410,8 +528,8 @@
             <w:tcMar>
               <w:top w:w="80" w:type="dxa"/>
               <w:bottom w:w="80" w:type="dxa"/>
-              <w:start w:w="120" w:type="dxa"/>
-              <w:end w:w="120" w:type="dxa"/>
+              <w:start w:w="100" w:type="dxa"/>
+              <w:end w:w="100" w:type="dxa"/>
             </w:tcMar>
             <w:vAlign w:val="center"/>
           </w:tcPr>
@@ -423,13 +541,13 @@
             <w:r/>
             <w:r>
               <w:rPr>
-                <w:rFonts w:ascii="Calibri" w:hAnsi="Calibri"/>
+                <w:rFonts w:ascii="Times New Roman" w:hAnsi="Times New Roman"/>
                 <w:b w:val="0"/>
                 <w:i w:val="0"/>
-                <w:color w:val="212529"/>
-                <w:sz w:val="19"/>
+                <w:color w:val="000000"/>
+                <w:sz w:val="17"/>
               </w:rPr>
-              <w:t>Base state plus one MPS prediction per stock</w:t>
+              <w:t>Base state plus one frozen MPS prediction per stock</w:t>
             </w:r>
           </w:p>
         </w:tc>
@@ -439,8 +557,8 @@
             <w:tcMar>
               <w:top w:w="80" w:type="dxa"/>
               <w:bottom w:w="80" w:type="dxa"/>
-              <w:start w:w="120" w:type="dxa"/>
-              <w:end w:w="120" w:type="dxa"/>
+              <w:start w:w="100" w:type="dxa"/>
+              <w:end w:w="100" w:type="dxa"/>
             </w:tcMar>
             <w:vAlign w:val="center"/>
           </w:tcPr>
@@ -452,11 +570,11 @@
             <w:r/>
             <w:r>
               <w:rPr>
-                <w:rFonts w:ascii="Calibri" w:hAnsi="Calibri"/>
+                <w:rFonts w:ascii="Times New Roman" w:hAnsi="Times New Roman"/>
                 <w:b w:val="0"/>
                 <w:i w:val="0"/>
-                <w:color w:val="212529"/>
-                <w:sz w:val="19"/>
+                <w:color w:val="000000"/>
+                <w:sz w:val="17"/>
               </w:rPr>
               <w:t>196</w:t>
             </w:r>
@@ -466,51 +584,99 @@
     </w:tbl>
     <w:p>
       <w:pPr>
-        <w:spacing w:after="0"/>
+        <w:spacing w:after="0" w:line="120" w:lineRule="auto"/>
       </w:pPr>
     </w:p>
     <w:p>
       <w:pPr/>
       <w:r>
         <w:rPr>
-          <w:rFonts w:ascii="Calibri" w:hAnsi="Calibri"/>
+          <w:rFonts w:ascii="Times New Roman" w:hAnsi="Times New Roman"/>
           <w:b w:val="0"/>
           <w:i w:val="0"/>
-          <w:color w:val="212529"/>
-          <w:sz w:val="22"/>
+          <w:color w:val="000000"/>
+          <w:sz w:val="21"/>
         </w:rPr>
-        <w:t>The base state contains 1 cash value, 15 prices, 15 holdings, and 10 indicators for each stock. For the signal agents, I appended 15 frozen next-day return predictions as one additional indicator block. The prediction model was not updated during PPO training.</w:t>
+        <w:t>The base state contained one cash value, 15 prices, 15 holdings, and 10 indicators for each stock. For the signal conditions, a 15-value prediction vector was appended as one additional indicator block.</w:t>
+      </w:r>
+    </w:p>
+    <w:p>
+      <w:pPr>
+        <w:spacing w:before="60" w:after="120"/>
+        <w:jc w:val="center"/>
+      </w:pPr>
+      <w:r>
+        <w:rPr>
+          <w:rFonts w:ascii="Times New Roman" w:hAnsi="Times New Roman"/>
+          <w:b w:val="0"/>
+          <w:i/>
+          <w:color w:val="000000"/>
+          <w:sz w:val="20"/>
+        </w:rPr>
+        <w:t>Base: 1 + 15 + 15 + (10 x 15) = 181 values</w:t>
+      </w:r>
+    </w:p>
+    <w:p>
+      <w:pPr>
+        <w:spacing w:before="60" w:after="120"/>
+        <w:jc w:val="center"/>
+      </w:pPr>
+      <w:r>
+        <w:rPr>
+          <w:rFonts w:ascii="Times New Roman" w:hAnsi="Times New Roman"/>
+          <w:b w:val="0"/>
+          <w:i/>
+          <w:color w:val="000000"/>
+          <w:sz w:val="20"/>
+        </w:rPr>
+        <w:t>Signal: 1 + 15 + 15 + (11 x 15) = 196 values</w:t>
       </w:r>
     </w:p>
     <w:p>
       <w:pPr/>
       <w:r>
         <w:rPr>
-          <w:rFonts w:ascii="Calibri" w:hAnsi="Calibri"/>
+          <w:rFonts w:ascii="Times New Roman" w:hAnsi="Times New Roman"/>
           <w:b w:val="0"/>
           <w:i w:val="0"/>
-          <w:color w:val="212529"/>
-          <w:sz w:val="22"/>
+          <w:color w:val="000000"/>
+          <w:sz w:val="21"/>
         </w:rPr>
-        <w:t>Both models used the same 13 inputs and had 369 trainable parameters. The ANN used 13-16-8-1 fully connected layers. The MPS used a trigonometric feature map with bond dimension 4. It ran on classical hardware and did not use qubits.</w:t>
+        <w:t>The prediction model was frozen during PPO training, so the ANN and MPS agents differed only in the final 15 state values.</w:t>
+      </w:r>
+    </w:p>
+    <w:p>
+      <w:pPr>
+        <w:pStyle w:val="Heading2"/>
+      </w:pPr>
+      <w:r>
+        <w:t>2.4 Trading setup</w:t>
       </w:r>
     </w:p>
     <w:p>
       <w:pPr/>
       <w:r>
         <w:rPr>
-          <w:rFonts w:ascii="Calibri" w:hAnsi="Calibri"/>
+          <w:rFonts w:ascii="Times New Roman" w:hAnsi="Times New Roman"/>
           <w:b w:val="0"/>
           <w:i w:val="0"/>
-          <w:color w:val="212529"/>
-          <w:sz w:val="22"/>
+          <w:color w:val="000000"/>
+          <w:sz w:val="21"/>
         </w:rPr>
-        <w:t>Each PPO condition used seeds 0, 1, and 2, a 5,000-step training budget, a $1,000,000 starting portfolio, and a 0.10% fee on every buy and sell. Turnover was calculated from executed traded notional divided by portfolio value at the start of the step.</w:t>
+        <w:t>Each PPO condition used the same two-layer 64-unit policy and value network, 5,000 environment steps, three optimization epochs per update, and seeds 0, 1, and 2. The starting portfolio was $1,000,000. A 0.10% transaction cost was applied to every executed buy and sell. Daily turnover was defined as gross executed notional divided by beginning-of-step portfolio value.</w:t>
       </w:r>
     </w:p>
     <w:p>
+      <w:pPr/>
       <w:r>
-        <w:br w:type="page"/>
+        <w:rPr>
+          <w:rFonts w:ascii="Times New Roman" w:hAnsi="Times New Roman"/>
+          <w:b w:val="0"/>
+          <w:i w:val="0"/>
+          <w:color w:val="000000"/>
+          <w:sz w:val="21"/>
+        </w:rPr>
+        <w:t>The backtest did not model bid-ask spread, slippage, market impact, taxes, liquidity limits, or borrow costs.</w:t>
       </w:r>
     </w:p>
     <w:p>
@@ -518,20 +684,43 @@
         <w:pStyle w:val="Heading1"/>
       </w:pPr>
       <w:r>
-        <w:t>Results</w:t>
+        <w:t>3. Results</w:t>
+      </w:r>
+    </w:p>
+    <w:p>
+      <w:pPr>
+        <w:pStyle w:val="Heading2"/>
+      </w:pPr>
+      <w:r>
+        <w:t>3.1 Prediction results</w:t>
       </w:r>
     </w:p>
     <w:p>
       <w:pPr/>
       <w:r>
         <w:rPr>
-          <w:rFonts w:ascii="Calibri" w:hAnsi="Calibri"/>
+          <w:rFonts w:ascii="Times New Roman" w:hAnsi="Times New Roman"/>
           <w:b w:val="0"/>
           <w:i w:val="0"/>
-          <w:color w:val="212529"/>
-          <w:sz w:val="22"/>
+          <w:color w:val="000000"/>
+          <w:sz w:val="21"/>
         </w:rPr>
-        <w:t>The MPS had slightly lower prediction error and higher directional accuracy, although its information coefficient was slightly negative.</w:t>
+        <w:t>The MPS achieved slightly lower mean-squared error and slightly higher directional accuracy. Its information coefficient was slightly negative, however, so the prediction evidence was mixed.</w:t>
+      </w:r>
+    </w:p>
+    <w:p>
+      <w:pPr>
+        <w:pStyle w:val="Caption"/>
+      </w:pPr>
+      <w:r>
+        <w:rPr>
+          <w:rFonts w:ascii="Times New Roman" w:hAnsi="Times New Roman"/>
+          <w:b w:val="0"/>
+          <w:i/>
+          <w:color w:val="000000"/>
+          <w:sz w:val="19"/>
+        </w:rPr>
+        <w:t>Table 2. Out-of-sample prediction results, 2019-2023</w:t>
       </w:r>
     </w:p>
     <w:tbl>
@@ -541,13 +730,14 @@
         <w:jc w:val="left"/>
         <w:tblLayout w:type="fixed"/>
         <w:tblLook w:firstColumn="1" w:firstRow="1" w:lastColumn="0" w:lastRow="0" w:noHBand="0" w:noVBand="1" w:val="04A0"/>
-        <w:tblInd w:w="120" w:type="dxa"/>
+        <w:tblInd w:w="100" w:type="dxa"/>
       </w:tblPr>
       <w:tblGrid>
-        <w:gridCol w:w="1560"/>
-        <w:gridCol w:w="1560"/>
-        <w:gridCol w:w="3120"/>
-        <w:gridCol w:w="3120"/>
+        <w:gridCol w:w="1150"/>
+        <w:gridCol w:w="1400"/>
+        <w:gridCol w:w="1500"/>
+        <w:gridCol w:w="2700"/>
+        <w:gridCol w:w="2610"/>
       </w:tblGrid>
       <w:tr>
         <w:trPr>
@@ -555,13 +745,13 @@
         </w:trPr>
         <w:tc>
           <w:tcPr>
-            <w:tcW w:type="dxa" w:w="1560"/>
-            <w:shd w:fill="F2F4F7"/>
+            <w:tcW w:type="dxa" w:w="1150"/>
+            <w:shd w:fill="E7E6E6"/>
             <w:tcMar>
               <w:top w:w="80" w:type="dxa"/>
               <w:bottom w:w="80" w:type="dxa"/>
-              <w:start w:w="120" w:type="dxa"/>
-              <w:end w:w="120" w:type="dxa"/>
+              <w:start w:w="100" w:type="dxa"/>
+              <w:end w:w="100" w:type="dxa"/>
             </w:tcMar>
             <w:vAlign w:val="center"/>
           </w:tcPr>
@@ -573,11 +763,11 @@
             <w:r/>
             <w:r>
               <w:rPr>
-                <w:rFonts w:ascii="Calibri" w:hAnsi="Calibri"/>
+                <w:rFonts w:ascii="Times New Roman" w:hAnsi="Times New Roman"/>
                 <w:b/>
                 <w:i w:val="0"/>
-                <w:color w:val="212529"/>
-                <w:sz w:val="19"/>
+                <w:color w:val="000000"/>
+                <w:sz w:val="17"/>
               </w:rPr>
               <w:t>Model</w:t>
             </w:r>
@@ -585,13 +775,13 @@
         </w:tc>
         <w:tc>
           <w:tcPr>
-            <w:tcW w:type="dxa" w:w="1560"/>
-            <w:shd w:fill="F2F4F7"/>
+            <w:tcW w:type="dxa" w:w="1400"/>
+            <w:shd w:fill="E7E6E6"/>
             <w:tcMar>
               <w:top w:w="80" w:type="dxa"/>
               <w:bottom w:w="80" w:type="dxa"/>
-              <w:start w:w="120" w:type="dxa"/>
-              <w:end w:w="120" w:type="dxa"/>
+              <w:start w:w="100" w:type="dxa"/>
+              <w:end w:w="100" w:type="dxa"/>
             </w:tcMar>
             <w:vAlign w:val="center"/>
           </w:tcPr>
@@ -603,25 +793,25 @@
             <w:r/>
             <w:r>
               <w:rPr>
-                <w:rFonts w:ascii="Calibri" w:hAnsi="Calibri"/>
+                <w:rFonts w:ascii="Times New Roman" w:hAnsi="Times New Roman"/>
                 <w:b/>
                 <w:i w:val="0"/>
-                <w:color w:val="212529"/>
-                <w:sz w:val="19"/>
+                <w:color w:val="000000"/>
+                <w:sz w:val="17"/>
               </w:rPr>
-              <w:t>MSE</w:t>
+              <w:t>Parameters</w:t>
             </w:r>
           </w:p>
         </w:tc>
         <w:tc>
           <w:tcPr>
-            <w:tcW w:type="dxa" w:w="3120"/>
-            <w:shd w:fill="F2F4F7"/>
+            <w:tcW w:type="dxa" w:w="1500"/>
+            <w:shd w:fill="E7E6E6"/>
             <w:tcMar>
               <w:top w:w="80" w:type="dxa"/>
               <w:bottom w:w="80" w:type="dxa"/>
-              <w:start w:w="120" w:type="dxa"/>
-              <w:end w:w="120" w:type="dxa"/>
+              <w:start w:w="100" w:type="dxa"/>
+              <w:end w:w="100" w:type="dxa"/>
             </w:tcMar>
             <w:vAlign w:val="center"/>
           </w:tcPr>
@@ -633,25 +823,25 @@
             <w:r/>
             <w:r>
               <w:rPr>
-                <w:rFonts w:ascii="Calibri" w:hAnsi="Calibri"/>
+                <w:rFonts w:ascii="Times New Roman" w:hAnsi="Times New Roman"/>
                 <w:b/>
                 <w:i w:val="0"/>
-                <w:color w:val="212529"/>
-                <w:sz w:val="19"/>
+                <w:color w:val="000000"/>
+                <w:sz w:val="17"/>
               </w:rPr>
-              <w:t>Directional accuracy</w:t>
+              <w:t>MSE</w:t>
             </w:r>
           </w:p>
         </w:tc>
         <w:tc>
           <w:tcPr>
-            <w:tcW w:type="dxa" w:w="3120"/>
-            <w:shd w:fill="F2F4F7"/>
+            <w:tcW w:type="dxa" w:w="2700"/>
+            <w:shd w:fill="E7E6E6"/>
             <w:tcMar>
               <w:top w:w="80" w:type="dxa"/>
               <w:bottom w:w="80" w:type="dxa"/>
-              <w:start w:w="120" w:type="dxa"/>
-              <w:end w:w="120" w:type="dxa"/>
+              <w:start w:w="100" w:type="dxa"/>
+              <w:end w:w="100" w:type="dxa"/>
             </w:tcMar>
             <w:vAlign w:val="center"/>
           </w:tcPr>
@@ -663,11 +853,41 @@
             <w:r/>
             <w:r>
               <w:rPr>
-                <w:rFonts w:ascii="Calibri" w:hAnsi="Calibri"/>
+                <w:rFonts w:ascii="Times New Roman" w:hAnsi="Times New Roman"/>
                 <w:b/>
                 <w:i w:val="0"/>
-                <w:color w:val="212529"/>
-                <w:sz w:val="19"/>
+                <w:color w:val="000000"/>
+                <w:sz w:val="17"/>
+              </w:rPr>
+              <w:t>Directional accuracy</w:t>
+            </w:r>
+          </w:p>
+        </w:tc>
+        <w:tc>
+          <w:tcPr>
+            <w:tcW w:type="dxa" w:w="2610"/>
+            <w:shd w:fill="E7E6E6"/>
+            <w:tcMar>
+              <w:top w:w="80" w:type="dxa"/>
+              <w:bottom w:w="80" w:type="dxa"/>
+              <w:start w:w="100" w:type="dxa"/>
+              <w:end w:w="100" w:type="dxa"/>
+            </w:tcMar>
+            <w:vAlign w:val="center"/>
+          </w:tcPr>
+          <w:p>
+            <w:pPr>
+              <w:spacing w:after="0"/>
+              <w:jc w:val="center"/>
+            </w:pPr>
+            <w:r/>
+            <w:r>
+              <w:rPr>
+                <w:rFonts w:ascii="Times New Roman" w:hAnsi="Times New Roman"/>
+                <w:b/>
+                <w:i w:val="0"/>
+                <w:color w:val="000000"/>
+                <w:sz w:val="17"/>
               </w:rPr>
               <w:t>Information coefficient</w:t>
             </w:r>
@@ -677,12 +897,12 @@
       <w:tr>
         <w:tc>
           <w:tcPr>
-            <w:tcW w:type="dxa" w:w="1560"/>
+            <w:tcW w:type="dxa" w:w="1150"/>
             <w:tcMar>
               <w:top w:w="80" w:type="dxa"/>
               <w:bottom w:w="80" w:type="dxa"/>
-              <w:start w:w="120" w:type="dxa"/>
-              <w:end w:w="120" w:type="dxa"/>
+              <w:start w:w="100" w:type="dxa"/>
+              <w:end w:w="100" w:type="dxa"/>
             </w:tcMar>
             <w:vAlign w:val="center"/>
           </w:tcPr>
@@ -694,11 +914,11 @@
             <w:r/>
             <w:r>
               <w:rPr>
-                <w:rFonts w:ascii="Calibri" w:hAnsi="Calibri"/>
+                <w:rFonts w:ascii="Times New Roman" w:hAnsi="Times New Roman"/>
                 <w:b w:val="0"/>
                 <w:i w:val="0"/>
-                <w:color w:val="212529"/>
-                <w:sz w:val="19"/>
+                <w:color w:val="000000"/>
+                <w:sz w:val="17"/>
               </w:rPr>
               <w:t>ANN</w:t>
             </w:r>
@@ -706,12 +926,12 @@
         </w:tc>
         <w:tc>
           <w:tcPr>
-            <w:tcW w:type="dxa" w:w="1560"/>
+            <w:tcW w:type="dxa" w:w="1400"/>
             <w:tcMar>
               <w:top w:w="80" w:type="dxa"/>
               <w:bottom w:w="80" w:type="dxa"/>
-              <w:start w:w="120" w:type="dxa"/>
-              <w:end w:w="120" w:type="dxa"/>
+              <w:start w:w="100" w:type="dxa"/>
+              <w:end w:w="100" w:type="dxa"/>
             </w:tcMar>
             <w:vAlign w:val="center"/>
           </w:tcPr>
@@ -723,24 +943,24 @@
             <w:r/>
             <w:r>
               <w:rPr>
-                <w:rFonts w:ascii="Calibri" w:hAnsi="Calibri"/>
+                <w:rFonts w:ascii="Times New Roman" w:hAnsi="Times New Roman"/>
                 <w:b w:val="0"/>
                 <w:i w:val="0"/>
-                <w:color w:val="212529"/>
-                <w:sz w:val="19"/>
+                <w:color w:val="000000"/>
+                <w:sz w:val="17"/>
               </w:rPr>
-              <w:t>1.5101</w:t>
+              <w:t>369</w:t>
             </w:r>
           </w:p>
         </w:tc>
         <w:tc>
           <w:tcPr>
-            <w:tcW w:type="dxa" w:w="3120"/>
+            <w:tcW w:type="dxa" w:w="1500"/>
             <w:tcMar>
               <w:top w:w="80" w:type="dxa"/>
               <w:bottom w:w="80" w:type="dxa"/>
-              <w:start w:w="120" w:type="dxa"/>
-              <w:end w:w="120" w:type="dxa"/>
+              <w:start w:w="100" w:type="dxa"/>
+              <w:end w:w="100" w:type="dxa"/>
             </w:tcMar>
             <w:vAlign w:val="center"/>
           </w:tcPr>
@@ -752,24 +972,24 @@
             <w:r/>
             <w:r>
               <w:rPr>
-                <w:rFonts w:ascii="Calibri" w:hAnsi="Calibri"/>
+                <w:rFonts w:ascii="Times New Roman" w:hAnsi="Times New Roman"/>
                 <w:b w:val="0"/>
                 <w:i w:val="0"/>
-                <w:color w:val="212529"/>
-                <w:sz w:val="19"/>
+                <w:color w:val="000000"/>
+                <w:sz w:val="17"/>
               </w:rPr>
-              <w:t>50.25%</w:t>
+              <w:t>1.5101</w:t>
             </w:r>
           </w:p>
         </w:tc>
         <w:tc>
           <w:tcPr>
-            <w:tcW w:type="dxa" w:w="3120"/>
+            <w:tcW w:type="dxa" w:w="2700"/>
             <w:tcMar>
               <w:top w:w="80" w:type="dxa"/>
               <w:bottom w:w="80" w:type="dxa"/>
-              <w:start w:w="120" w:type="dxa"/>
-              <w:end w:w="120" w:type="dxa"/>
+              <w:start w:w="100" w:type="dxa"/>
+              <w:end w:w="100" w:type="dxa"/>
             </w:tcMar>
             <w:vAlign w:val="center"/>
           </w:tcPr>
@@ -781,11 +1001,40 @@
             <w:r/>
             <w:r>
               <w:rPr>
-                <w:rFonts w:ascii="Calibri" w:hAnsi="Calibri"/>
+                <w:rFonts w:ascii="Times New Roman" w:hAnsi="Times New Roman"/>
                 <w:b w:val="0"/>
                 <w:i w:val="0"/>
-                <w:color w:val="212529"/>
-                <w:sz w:val="19"/>
+                <w:color w:val="000000"/>
+                <w:sz w:val="17"/>
+              </w:rPr>
+              <w:t>50.25%</w:t>
+            </w:r>
+          </w:p>
+        </w:tc>
+        <w:tc>
+          <w:tcPr>
+            <w:tcW w:type="dxa" w:w="2610"/>
+            <w:tcMar>
+              <w:top w:w="80" w:type="dxa"/>
+              <w:bottom w:w="80" w:type="dxa"/>
+              <w:start w:w="100" w:type="dxa"/>
+              <w:end w:w="100" w:type="dxa"/>
+            </w:tcMar>
+            <w:vAlign w:val="center"/>
+          </w:tcPr>
+          <w:p>
+            <w:pPr>
+              <w:spacing w:after="0"/>
+              <w:jc w:val="center"/>
+            </w:pPr>
+            <w:r/>
+            <w:r>
+              <w:rPr>
+                <w:rFonts w:ascii="Times New Roman" w:hAnsi="Times New Roman"/>
+                <w:b w:val="0"/>
+                <w:i w:val="0"/>
+                <w:color w:val="000000"/>
+                <w:sz w:val="17"/>
               </w:rPr>
               <w:t>+0.0119</w:t>
             </w:r>
@@ -795,12 +1044,12 @@
       <w:tr>
         <w:tc>
           <w:tcPr>
-            <w:tcW w:type="dxa" w:w="1560"/>
+            <w:tcW w:type="dxa" w:w="1150"/>
             <w:tcMar>
               <w:top w:w="80" w:type="dxa"/>
               <w:bottom w:w="80" w:type="dxa"/>
-              <w:start w:w="120" w:type="dxa"/>
-              <w:end w:w="120" w:type="dxa"/>
+              <w:start w:w="100" w:type="dxa"/>
+              <w:end w:w="100" w:type="dxa"/>
             </w:tcMar>
             <w:vAlign w:val="center"/>
           </w:tcPr>
@@ -812,11 +1061,11 @@
             <w:r/>
             <w:r>
               <w:rPr>
-                <w:rFonts w:ascii="Calibri" w:hAnsi="Calibri"/>
+                <w:rFonts w:ascii="Times New Roman" w:hAnsi="Times New Roman"/>
                 <w:b w:val="0"/>
                 <w:i w:val="0"/>
-                <w:color w:val="212529"/>
-                <w:sz w:val="19"/>
+                <w:color w:val="000000"/>
+                <w:sz w:val="17"/>
               </w:rPr>
               <w:t>MPS</w:t>
             </w:r>
@@ -824,12 +1073,12 @@
         </w:tc>
         <w:tc>
           <w:tcPr>
-            <w:tcW w:type="dxa" w:w="1560"/>
+            <w:tcW w:type="dxa" w:w="1400"/>
             <w:tcMar>
               <w:top w:w="80" w:type="dxa"/>
               <w:bottom w:w="80" w:type="dxa"/>
-              <w:start w:w="120" w:type="dxa"/>
-              <w:end w:w="120" w:type="dxa"/>
+              <w:start w:w="100" w:type="dxa"/>
+              <w:end w:w="100" w:type="dxa"/>
             </w:tcMar>
             <w:vAlign w:val="center"/>
           </w:tcPr>
@@ -841,24 +1090,24 @@
             <w:r/>
             <w:r>
               <w:rPr>
-                <w:rFonts w:ascii="Calibri" w:hAnsi="Calibri"/>
+                <w:rFonts w:ascii="Times New Roman" w:hAnsi="Times New Roman"/>
                 <w:b w:val="0"/>
                 <w:i w:val="0"/>
-                <w:color w:val="212529"/>
-                <w:sz w:val="19"/>
+                <w:color w:val="000000"/>
+                <w:sz w:val="17"/>
               </w:rPr>
-              <w:t>1.5034</w:t>
+              <w:t>369</w:t>
             </w:r>
           </w:p>
         </w:tc>
         <w:tc>
           <w:tcPr>
-            <w:tcW w:type="dxa" w:w="3120"/>
+            <w:tcW w:type="dxa" w:w="1500"/>
             <w:tcMar>
               <w:top w:w="80" w:type="dxa"/>
               <w:bottom w:w="80" w:type="dxa"/>
-              <w:start w:w="120" w:type="dxa"/>
-              <w:end w:w="120" w:type="dxa"/>
+              <w:start w:w="100" w:type="dxa"/>
+              <w:end w:w="100" w:type="dxa"/>
             </w:tcMar>
             <w:vAlign w:val="center"/>
           </w:tcPr>
@@ -870,24 +1119,24 @@
             <w:r/>
             <w:r>
               <w:rPr>
-                <w:rFonts w:ascii="Calibri" w:hAnsi="Calibri"/>
+                <w:rFonts w:ascii="Times New Roman" w:hAnsi="Times New Roman"/>
                 <w:b w:val="0"/>
                 <w:i w:val="0"/>
-                <w:color w:val="212529"/>
-                <w:sz w:val="19"/>
+                <w:color w:val="000000"/>
+                <w:sz w:val="17"/>
               </w:rPr>
-              <w:t>51.06%</w:t>
+              <w:t>1.5034</w:t>
             </w:r>
           </w:p>
         </w:tc>
         <w:tc>
           <w:tcPr>
-            <w:tcW w:type="dxa" w:w="3120"/>
+            <w:tcW w:type="dxa" w:w="2700"/>
             <w:tcMar>
               <w:top w:w="80" w:type="dxa"/>
               <w:bottom w:w="80" w:type="dxa"/>
-              <w:start w:w="120" w:type="dxa"/>
-              <w:end w:w="120" w:type="dxa"/>
+              <w:start w:w="100" w:type="dxa"/>
+              <w:end w:w="100" w:type="dxa"/>
             </w:tcMar>
             <w:vAlign w:val="center"/>
           </w:tcPr>
@@ -899,11 +1148,40 @@
             <w:r/>
             <w:r>
               <w:rPr>
-                <w:rFonts w:ascii="Calibri" w:hAnsi="Calibri"/>
+                <w:rFonts w:ascii="Times New Roman" w:hAnsi="Times New Roman"/>
                 <w:b w:val="0"/>
                 <w:i w:val="0"/>
-                <w:color w:val="212529"/>
-                <w:sz w:val="19"/>
+                <w:color w:val="000000"/>
+                <w:sz w:val="17"/>
+              </w:rPr>
+              <w:t>51.06%</w:t>
+            </w:r>
+          </w:p>
+        </w:tc>
+        <w:tc>
+          <w:tcPr>
+            <w:tcW w:type="dxa" w:w="2610"/>
+            <w:tcMar>
+              <w:top w:w="80" w:type="dxa"/>
+              <w:bottom w:w="80" w:type="dxa"/>
+              <w:start w:w="100" w:type="dxa"/>
+              <w:end w:w="100" w:type="dxa"/>
+            </w:tcMar>
+            <w:vAlign w:val="center"/>
+          </w:tcPr>
+          <w:p>
+            <w:pPr>
+              <w:spacing w:after="0"/>
+              <w:jc w:val="center"/>
+            </w:pPr>
+            <w:r/>
+            <w:r>
+              <w:rPr>
+                <w:rFonts w:ascii="Times New Roman" w:hAnsi="Times New Roman"/>
+                <w:b w:val="0"/>
+                <w:i w:val="0"/>
+                <w:color w:val="000000"/>
+                <w:sz w:val="17"/>
               </w:rPr>
               <w:t>-0.0060</w:t>
             </w:r>
@@ -913,20 +1191,43 @@
     </w:tbl>
     <w:p>
       <w:pPr>
-        <w:spacing w:after="0"/>
+        <w:spacing w:after="0" w:line="120" w:lineRule="auto"/>
       </w:pPr>
+    </w:p>
+    <w:p>
+      <w:pPr>
+        <w:pStyle w:val="Heading2"/>
+      </w:pPr>
+      <w:r>
+        <w:t>3.2 Trading results</w:t>
+      </w:r>
     </w:p>
     <w:p>
       <w:pPr/>
       <w:r>
         <w:rPr>
-          <w:rFonts w:ascii="Calibri" w:hAnsi="Calibri"/>
+          <w:rFonts w:ascii="Times New Roman" w:hAnsi="Times New Roman"/>
           <w:b w:val="0"/>
           <w:i w:val="0"/>
-          <w:color w:val="212529"/>
-          <w:sz w:val="22"/>
+          <w:color w:val="000000"/>
+          <w:sz w:val="21"/>
         </w:rPr>
-        <w:t>The small prediction improvement did not carry over to trading.</w:t>
+        <w:t>The small improvement in two prediction metrics did not carry over to the PPO backtest.</w:t>
+      </w:r>
+    </w:p>
+    <w:p>
+      <w:pPr>
+        <w:pStyle w:val="Caption"/>
+      </w:pPr>
+      <w:r>
+        <w:rPr>
+          <w:rFonts w:ascii="Times New Roman" w:hAnsi="Times New Roman"/>
+          <w:b w:val="0"/>
+          <w:i/>
+          <w:color w:val="000000"/>
+          <w:sz w:val="19"/>
+        </w:rPr>
+        <w:t>Table 3. Mean out-of-sample portfolio results</w:t>
       </w:r>
     </w:p>
     <w:tbl>
@@ -936,15 +1237,15 @@
         <w:jc w:val="left"/>
         <w:tblLayout w:type="fixed"/>
         <w:tblLook w:firstColumn="1" w:firstRow="1" w:lastColumn="0" w:lastRow="0" w:noHBand="0" w:noVBand="1" w:val="04A0"/>
-        <w:tblInd w:w="120" w:type="dxa"/>
+        <w:tblInd w:w="100" w:type="dxa"/>
       </w:tblPr>
       <w:tblGrid>
-        <w:gridCol w:w="1820"/>
+        <w:gridCol w:w="1760"/>
+        <w:gridCol w:w="1380"/>
+        <w:gridCol w:w="1080"/>
+        <w:gridCol w:w="1900"/>
         <w:gridCol w:w="1400"/>
-        <w:gridCol w:w="1150"/>
-        <w:gridCol w:w="1650"/>
-        <w:gridCol w:w="1450"/>
-        <w:gridCol w:w="1890"/>
+        <w:gridCol w:w="1840"/>
       </w:tblGrid>
       <w:tr>
         <w:trPr>
@@ -952,13 +1253,13 @@
         </w:trPr>
         <w:tc>
           <w:tcPr>
-            <w:tcW w:type="dxa" w:w="1820"/>
-            <w:shd w:fill="F2F4F7"/>
+            <w:tcW w:type="dxa" w:w="1760"/>
+            <w:shd w:fill="E7E6E6"/>
             <w:tcMar>
               <w:top w:w="80" w:type="dxa"/>
               <w:bottom w:w="80" w:type="dxa"/>
-              <w:start w:w="120" w:type="dxa"/>
-              <w:end w:w="120" w:type="dxa"/>
+              <w:start w:w="100" w:type="dxa"/>
+              <w:end w:w="100" w:type="dxa"/>
             </w:tcMar>
             <w:vAlign w:val="center"/>
           </w:tcPr>
@@ -970,25 +1271,25 @@
             <w:r/>
             <w:r>
               <w:rPr>
-                <w:rFonts w:ascii="Calibri" w:hAnsi="Calibri"/>
+                <w:rFonts w:ascii="Times New Roman" w:hAnsi="Times New Roman"/>
                 <w:b/>
                 <w:i w:val="0"/>
-                <w:color w:val="212529"/>
-                <w:sz w:val="19"/>
+                <w:color w:val="000000"/>
+                <w:sz w:val="17"/>
               </w:rPr>
-              <w:t>Agent</w:t>
+              <w:t>Condition</w:t>
             </w:r>
           </w:p>
         </w:tc>
         <w:tc>
           <w:tcPr>
-            <w:tcW w:type="dxa" w:w="1400"/>
-            <w:shd w:fill="F2F4F7"/>
+            <w:tcW w:type="dxa" w:w="1380"/>
+            <w:shd w:fill="E7E6E6"/>
             <w:tcMar>
               <w:top w:w="80" w:type="dxa"/>
               <w:bottom w:w="80" w:type="dxa"/>
-              <w:start w:w="120" w:type="dxa"/>
-              <w:end w:w="120" w:type="dxa"/>
+              <w:start w:w="100" w:type="dxa"/>
+              <w:end w:w="100" w:type="dxa"/>
             </w:tcMar>
             <w:vAlign w:val="center"/>
           </w:tcPr>
@@ -1000,11 +1301,11 @@
             <w:r/>
             <w:r>
               <w:rPr>
-                <w:rFonts w:ascii="Calibri" w:hAnsi="Calibri"/>
+                <w:rFonts w:ascii="Times New Roman" w:hAnsi="Times New Roman"/>
                 <w:b/>
                 <w:i w:val="0"/>
-                <w:color w:val="212529"/>
-                <w:sz w:val="19"/>
+                <w:color w:val="000000"/>
+                <w:sz w:val="17"/>
               </w:rPr>
               <w:t>Total return</w:t>
             </w:r>
@@ -1012,13 +1313,13 @@
         </w:tc>
         <w:tc>
           <w:tcPr>
-            <w:tcW w:type="dxa" w:w="1150"/>
-            <w:shd w:fill="F2F4F7"/>
+            <w:tcW w:type="dxa" w:w="1080"/>
+            <w:shd w:fill="E7E6E6"/>
             <w:tcMar>
               <w:top w:w="80" w:type="dxa"/>
               <w:bottom w:w="80" w:type="dxa"/>
-              <w:start w:w="120" w:type="dxa"/>
-              <w:end w:w="120" w:type="dxa"/>
+              <w:start w:w="100" w:type="dxa"/>
+              <w:end w:w="100" w:type="dxa"/>
             </w:tcMar>
             <w:vAlign w:val="center"/>
           </w:tcPr>
@@ -1030,11 +1331,11 @@
             <w:r/>
             <w:r>
               <w:rPr>
-                <w:rFonts w:ascii="Calibri" w:hAnsi="Calibri"/>
+                <w:rFonts w:ascii="Times New Roman" w:hAnsi="Times New Roman"/>
                 <w:b/>
                 <w:i w:val="0"/>
-                <w:color w:val="212529"/>
-                <w:sz w:val="19"/>
+                <w:color w:val="000000"/>
+                <w:sz w:val="17"/>
               </w:rPr>
               <w:t>Sharpe</w:t>
             </w:r>
@@ -1042,13 +1343,13 @@
         </w:tc>
         <w:tc>
           <w:tcPr>
-            <w:tcW w:type="dxa" w:w="1650"/>
-            <w:shd w:fill="F2F4F7"/>
+            <w:tcW w:type="dxa" w:w="1900"/>
+            <w:shd w:fill="E7E6E6"/>
             <w:tcMar>
               <w:top w:w="80" w:type="dxa"/>
               <w:bottom w:w="80" w:type="dxa"/>
-              <w:start w:w="120" w:type="dxa"/>
-              <w:end w:w="120" w:type="dxa"/>
+              <w:start w:w="100" w:type="dxa"/>
+              <w:end w:w="100" w:type="dxa"/>
             </w:tcMar>
             <w:vAlign w:val="center"/>
           </w:tcPr>
@@ -1060,25 +1361,25 @@
             <w:r/>
             <w:r>
               <w:rPr>
-                <w:rFonts w:ascii="Calibri" w:hAnsi="Calibri"/>
+                <w:rFonts w:ascii="Times New Roman" w:hAnsi="Times New Roman"/>
                 <w:b/>
                 <w:i w:val="0"/>
-                <w:color w:val="212529"/>
-                <w:sz w:val="19"/>
+                <w:color w:val="000000"/>
+                <w:sz w:val="17"/>
               </w:rPr>
-              <w:t>Max drawdown</w:t>
+              <w:t>Maximum drawdown</w:t>
             </w:r>
           </w:p>
         </w:tc>
         <w:tc>
           <w:tcPr>
-            <w:tcW w:type="dxa" w:w="1450"/>
-            <w:shd w:fill="F2F4F7"/>
+            <w:tcW w:type="dxa" w:w="1400"/>
+            <w:shd w:fill="E7E6E6"/>
             <w:tcMar>
               <w:top w:w="80" w:type="dxa"/>
               <w:bottom w:w="80" w:type="dxa"/>
-              <w:start w:w="120" w:type="dxa"/>
-              <w:end w:w="120" w:type="dxa"/>
+              <w:start w:w="100" w:type="dxa"/>
+              <w:end w:w="100" w:type="dxa"/>
             </w:tcMar>
             <w:vAlign w:val="center"/>
           </w:tcPr>
@@ -1090,11 +1391,11 @@
             <w:r/>
             <w:r>
               <w:rPr>
-                <w:rFonts w:ascii="Calibri" w:hAnsi="Calibri"/>
+                <w:rFonts w:ascii="Times New Roman" w:hAnsi="Times New Roman"/>
                 <w:b/>
                 <w:i w:val="0"/>
-                <w:color w:val="212529"/>
-                <w:sz w:val="19"/>
+                <w:color w:val="000000"/>
+                <w:sz w:val="17"/>
               </w:rPr>
               <w:t>Turnover</w:t>
             </w:r>
@@ -1102,13 +1403,13 @@
         </w:tc>
         <w:tc>
           <w:tcPr>
-            <w:tcW w:type="dxa" w:w="1890"/>
-            <w:shd w:fill="F2F4F7"/>
+            <w:tcW w:type="dxa" w:w="1840"/>
+            <w:shd w:fill="E7E6E6"/>
             <w:tcMar>
               <w:top w:w="80" w:type="dxa"/>
               <w:bottom w:w="80" w:type="dxa"/>
-              <w:start w:w="120" w:type="dxa"/>
-              <w:end w:w="120" w:type="dxa"/>
+              <w:start w:w="100" w:type="dxa"/>
+              <w:end w:w="100" w:type="dxa"/>
             </w:tcMar>
             <w:vAlign w:val="center"/>
           </w:tcPr>
@@ -1120,11 +1421,11 @@
             <w:r/>
             <w:r>
               <w:rPr>
-                <w:rFonts w:ascii="Calibri" w:hAnsi="Calibri"/>
+                <w:rFonts w:ascii="Times New Roman" w:hAnsi="Times New Roman"/>
                 <w:b/>
                 <w:i w:val="0"/>
-                <w:color w:val="212529"/>
-                <w:sz w:val="19"/>
+                <w:color w:val="000000"/>
+                <w:sz w:val="17"/>
               </w:rPr>
               <w:t>Total cost</w:t>
             </w:r>
@@ -1134,12 +1435,12 @@
       <w:tr>
         <w:tc>
           <w:tcPr>
-            <w:tcW w:type="dxa" w:w="1820"/>
+            <w:tcW w:type="dxa" w:w="1760"/>
             <w:tcMar>
               <w:top w:w="80" w:type="dxa"/>
               <w:bottom w:w="80" w:type="dxa"/>
-              <w:start w:w="120" w:type="dxa"/>
-              <w:end w:w="120" w:type="dxa"/>
+              <w:start w:w="100" w:type="dxa"/>
+              <w:end w:w="100" w:type="dxa"/>
             </w:tcMar>
             <w:vAlign w:val="center"/>
           </w:tcPr>
@@ -1151,11 +1452,11 @@
             <w:r/>
             <w:r>
               <w:rPr>
-                <w:rFonts w:ascii="Calibri" w:hAnsi="Calibri"/>
+                <w:rFonts w:ascii="Times New Roman" w:hAnsi="Times New Roman"/>
                 <w:b w:val="0"/>
                 <w:i w:val="0"/>
-                <w:color w:val="212529"/>
-                <w:sz w:val="19"/>
+                <w:color w:val="000000"/>
+                <w:sz w:val="17"/>
               </w:rPr>
               <w:t>Base FinRL</w:t>
             </w:r>
@@ -1163,12 +1464,12 @@
         </w:tc>
         <w:tc>
           <w:tcPr>
-            <w:tcW w:type="dxa" w:w="1400"/>
+            <w:tcW w:type="dxa" w:w="1380"/>
             <w:tcMar>
               <w:top w:w="80" w:type="dxa"/>
               <w:bottom w:w="80" w:type="dxa"/>
-              <w:start w:w="120" w:type="dxa"/>
-              <w:end w:w="120" w:type="dxa"/>
+              <w:start w:w="100" w:type="dxa"/>
+              <w:end w:w="100" w:type="dxa"/>
             </w:tcMar>
             <w:vAlign w:val="center"/>
           </w:tcPr>
@@ -1180,11 +1481,11 @@
             <w:r/>
             <w:r>
               <w:rPr>
-                <w:rFonts w:ascii="Calibri" w:hAnsi="Calibri"/>
+                <w:rFonts w:ascii="Times New Roman" w:hAnsi="Times New Roman"/>
                 <w:b w:val="0"/>
                 <w:i w:val="0"/>
-                <w:color w:val="212529"/>
-                <w:sz w:val="19"/>
+                <w:color w:val="000000"/>
+                <w:sz w:val="17"/>
               </w:rPr>
               <w:t>73.24%</w:t>
             </w:r>
@@ -1192,12 +1493,12 @@
         </w:tc>
         <w:tc>
           <w:tcPr>
-            <w:tcW w:type="dxa" w:w="1150"/>
+            <w:tcW w:type="dxa" w:w="1080"/>
             <w:tcMar>
               <w:top w:w="80" w:type="dxa"/>
               <w:bottom w:w="80" w:type="dxa"/>
-              <w:start w:w="120" w:type="dxa"/>
-              <w:end w:w="120" w:type="dxa"/>
+              <w:start w:w="100" w:type="dxa"/>
+              <w:end w:w="100" w:type="dxa"/>
             </w:tcMar>
             <w:vAlign w:val="center"/>
           </w:tcPr>
@@ -1209,11 +1510,11 @@
             <w:r/>
             <w:r>
               <w:rPr>
-                <w:rFonts w:ascii="Calibri" w:hAnsi="Calibri"/>
+                <w:rFonts w:ascii="Times New Roman" w:hAnsi="Times New Roman"/>
                 <w:b w:val="0"/>
                 <w:i w:val="0"/>
-                <w:color w:val="212529"/>
-                <w:sz w:val="19"/>
+                <w:color w:val="000000"/>
+                <w:sz w:val="17"/>
               </w:rPr>
               <w:t>0.559</w:t>
             </w:r>
@@ -1221,12 +1522,12 @@
         </w:tc>
         <w:tc>
           <w:tcPr>
-            <w:tcW w:type="dxa" w:w="1650"/>
+            <w:tcW w:type="dxa" w:w="1900"/>
             <w:tcMar>
               <w:top w:w="80" w:type="dxa"/>
               <w:bottom w:w="80" w:type="dxa"/>
-              <w:start w:w="120" w:type="dxa"/>
-              <w:end w:w="120" w:type="dxa"/>
+              <w:start w:w="100" w:type="dxa"/>
+              <w:end w:w="100" w:type="dxa"/>
             </w:tcMar>
             <w:vAlign w:val="center"/>
           </w:tcPr>
@@ -1238,11 +1539,11 @@
             <w:r/>
             <w:r>
               <w:rPr>
-                <w:rFonts w:ascii="Calibri" w:hAnsi="Calibri"/>
+                <w:rFonts w:ascii="Times New Roman" w:hAnsi="Times New Roman"/>
                 <w:b w:val="0"/>
                 <w:i w:val="0"/>
-                <w:color w:val="212529"/>
-                <w:sz w:val="19"/>
+                <w:color w:val="000000"/>
+                <w:sz w:val="17"/>
               </w:rPr>
               <w:t>-40.46%</w:t>
             </w:r>
@@ -1250,12 +1551,12 @@
         </w:tc>
         <w:tc>
           <w:tcPr>
-            <w:tcW w:type="dxa" w:w="1450"/>
+            <w:tcW w:type="dxa" w:w="1400"/>
             <w:tcMar>
               <w:top w:w="80" w:type="dxa"/>
               <w:bottom w:w="80" w:type="dxa"/>
-              <w:start w:w="120" w:type="dxa"/>
-              <w:end w:w="120" w:type="dxa"/>
+              <w:start w:w="100" w:type="dxa"/>
+              <w:end w:w="100" w:type="dxa"/>
             </w:tcMar>
             <w:vAlign w:val="center"/>
           </w:tcPr>
@@ -1267,11 +1568,11 @@
             <w:r/>
             <w:r>
               <w:rPr>
-                <w:rFonts w:ascii="Calibri" w:hAnsi="Calibri"/>
+                <w:rFonts w:ascii="Times New Roman" w:hAnsi="Times New Roman"/>
                 <w:b w:val="0"/>
                 <w:i w:val="0"/>
-                <w:color w:val="212529"/>
-                <w:sz w:val="19"/>
+                <w:color w:val="000000"/>
+                <w:sz w:val="17"/>
               </w:rPr>
               <w:t>26.43%</w:t>
             </w:r>
@@ -1279,12 +1580,12 @@
         </w:tc>
         <w:tc>
           <w:tcPr>
-            <w:tcW w:type="dxa" w:w="1890"/>
+            <w:tcW w:type="dxa" w:w="1840"/>
             <w:tcMar>
               <w:top w:w="80" w:type="dxa"/>
               <w:bottom w:w="80" w:type="dxa"/>
-              <w:start w:w="120" w:type="dxa"/>
-              <w:end w:w="120" w:type="dxa"/>
+              <w:start w:w="100" w:type="dxa"/>
+              <w:end w:w="100" w:type="dxa"/>
             </w:tcMar>
             <w:vAlign w:val="center"/>
           </w:tcPr>
@@ -1296,11 +1597,11 @@
             <w:r/>
             <w:r>
               <w:rPr>
-                <w:rFonts w:ascii="Calibri" w:hAnsi="Calibri"/>
+                <w:rFonts w:ascii="Times New Roman" w:hAnsi="Times New Roman"/>
                 <w:b w:val="0"/>
                 <w:i w:val="0"/>
-                <w:color w:val="212529"/>
-                <w:sz w:val="19"/>
+                <w:color w:val="000000"/>
+                <w:sz w:val="17"/>
               </w:rPr>
               <w:t>$1,375.38</w:t>
             </w:r>
@@ -1310,12 +1611,12 @@
       <w:tr>
         <w:tc>
           <w:tcPr>
-            <w:tcW w:type="dxa" w:w="1820"/>
+            <w:tcW w:type="dxa" w:w="1760"/>
             <w:tcMar>
               <w:top w:w="80" w:type="dxa"/>
               <w:bottom w:w="80" w:type="dxa"/>
-              <w:start w:w="120" w:type="dxa"/>
-              <w:end w:w="120" w:type="dxa"/>
+              <w:start w:w="100" w:type="dxa"/>
+              <w:end w:w="100" w:type="dxa"/>
             </w:tcMar>
             <w:vAlign w:val="center"/>
           </w:tcPr>
@@ -1327,11 +1628,11 @@
             <w:r/>
             <w:r>
               <w:rPr>
-                <w:rFonts w:ascii="Calibri" w:hAnsi="Calibri"/>
+                <w:rFonts w:ascii="Times New Roman" w:hAnsi="Times New Roman"/>
                 <w:b w:val="0"/>
                 <w:i w:val="0"/>
-                <w:color w:val="212529"/>
-                <w:sz w:val="19"/>
+                <w:color w:val="000000"/>
+                <w:sz w:val="17"/>
               </w:rPr>
               <w:t>ANN signal</w:t>
             </w:r>
@@ -1339,12 +1640,12 @@
         </w:tc>
         <w:tc>
           <w:tcPr>
-            <w:tcW w:type="dxa" w:w="1400"/>
+            <w:tcW w:type="dxa" w:w="1380"/>
             <w:tcMar>
               <w:top w:w="80" w:type="dxa"/>
               <w:bottom w:w="80" w:type="dxa"/>
-              <w:start w:w="120" w:type="dxa"/>
-              <w:end w:w="120" w:type="dxa"/>
+              <w:start w:w="100" w:type="dxa"/>
+              <w:end w:w="100" w:type="dxa"/>
             </w:tcMar>
             <w:vAlign w:val="center"/>
           </w:tcPr>
@@ -1356,11 +1657,11 @@
             <w:r/>
             <w:r>
               <w:rPr>
-                <w:rFonts w:ascii="Calibri" w:hAnsi="Calibri"/>
+                <w:rFonts w:ascii="Times New Roman" w:hAnsi="Times New Roman"/>
                 <w:b w:val="0"/>
                 <w:i w:val="0"/>
-                <w:color w:val="212529"/>
-                <w:sz w:val="19"/>
+                <w:color w:val="000000"/>
+                <w:sz w:val="17"/>
               </w:rPr>
               <w:t>104.66%</w:t>
             </w:r>
@@ -1368,12 +1669,12 @@
         </w:tc>
         <w:tc>
           <w:tcPr>
-            <w:tcW w:type="dxa" w:w="1150"/>
+            <w:tcW w:type="dxa" w:w="1080"/>
             <w:tcMar>
               <w:top w:w="80" w:type="dxa"/>
               <w:bottom w:w="80" w:type="dxa"/>
-              <w:start w:w="120" w:type="dxa"/>
-              <w:end w:w="120" w:type="dxa"/>
+              <w:start w:w="100" w:type="dxa"/>
+              <w:end w:w="100" w:type="dxa"/>
             </w:tcMar>
             <w:vAlign w:val="center"/>
           </w:tcPr>
@@ -1385,11 +1686,11 @@
             <w:r/>
             <w:r>
               <w:rPr>
-                <w:rFonts w:ascii="Calibri" w:hAnsi="Calibri"/>
+                <w:rFonts w:ascii="Times New Roman" w:hAnsi="Times New Roman"/>
                 <w:b w:val="0"/>
                 <w:i w:val="0"/>
-                <w:color w:val="212529"/>
-                <w:sz w:val="19"/>
+                <w:color w:val="000000"/>
+                <w:sz w:val="17"/>
               </w:rPr>
               <w:t>0.735</w:t>
             </w:r>
@@ -1397,12 +1698,12 @@
         </w:tc>
         <w:tc>
           <w:tcPr>
-            <w:tcW w:type="dxa" w:w="1650"/>
+            <w:tcW w:type="dxa" w:w="1900"/>
             <w:tcMar>
               <w:top w:w="80" w:type="dxa"/>
               <w:bottom w:w="80" w:type="dxa"/>
-              <w:start w:w="120" w:type="dxa"/>
-              <w:end w:w="120" w:type="dxa"/>
+              <w:start w:w="100" w:type="dxa"/>
+              <w:end w:w="100" w:type="dxa"/>
             </w:tcMar>
             <w:vAlign w:val="center"/>
           </w:tcPr>
@@ -1414,11 +1715,11 @@
             <w:r/>
             <w:r>
               <w:rPr>
-                <w:rFonts w:ascii="Calibri" w:hAnsi="Calibri"/>
+                <w:rFonts w:ascii="Times New Roman" w:hAnsi="Times New Roman"/>
                 <w:b w:val="0"/>
                 <w:i w:val="0"/>
-                <w:color w:val="212529"/>
-                <w:sz w:val="19"/>
+                <w:color w:val="000000"/>
+                <w:sz w:val="17"/>
               </w:rPr>
               <w:t>-27.55%</w:t>
             </w:r>
@@ -1426,12 +1727,12 @@
         </w:tc>
         <w:tc>
           <w:tcPr>
-            <w:tcW w:type="dxa" w:w="1450"/>
+            <w:tcW w:type="dxa" w:w="1400"/>
             <w:tcMar>
               <w:top w:w="80" w:type="dxa"/>
               <w:bottom w:w="80" w:type="dxa"/>
-              <w:start w:w="120" w:type="dxa"/>
-              <w:end w:w="120" w:type="dxa"/>
+              <w:start w:w="100" w:type="dxa"/>
+              <w:end w:w="100" w:type="dxa"/>
             </w:tcMar>
             <w:vAlign w:val="center"/>
           </w:tcPr>
@@ -1443,11 +1744,11 @@
             <w:r/>
             <w:r>
               <w:rPr>
-                <w:rFonts w:ascii="Calibri" w:hAnsi="Calibri"/>
+                <w:rFonts w:ascii="Times New Roman" w:hAnsi="Times New Roman"/>
                 <w:b w:val="0"/>
                 <w:i w:val="0"/>
-                <w:color w:val="212529"/>
-                <w:sz w:val="19"/>
+                <w:color w:val="000000"/>
+                <w:sz w:val="17"/>
               </w:rPr>
               <w:t>27.32%</w:t>
             </w:r>
@@ -1455,12 +1756,12 @@
         </w:tc>
         <w:tc>
           <w:tcPr>
-            <w:tcW w:type="dxa" w:w="1890"/>
+            <w:tcW w:type="dxa" w:w="1840"/>
             <w:tcMar>
               <w:top w:w="80" w:type="dxa"/>
               <w:bottom w:w="80" w:type="dxa"/>
-              <w:start w:w="120" w:type="dxa"/>
-              <w:end w:w="120" w:type="dxa"/>
+              <w:start w:w="100" w:type="dxa"/>
+              <w:end w:w="100" w:type="dxa"/>
             </w:tcMar>
             <w:vAlign w:val="center"/>
           </w:tcPr>
@@ -1472,11 +1773,11 @@
             <w:r/>
             <w:r>
               <w:rPr>
-                <w:rFonts w:ascii="Calibri" w:hAnsi="Calibri"/>
+                <w:rFonts w:ascii="Times New Roman" w:hAnsi="Times New Roman"/>
                 <w:b w:val="0"/>
                 <w:i w:val="0"/>
-                <w:color w:val="212529"/>
-                <w:sz w:val="19"/>
+                <w:color w:val="000000"/>
+                <w:sz w:val="17"/>
               </w:rPr>
               <w:t>$1,429.65</w:t>
             </w:r>
@@ -1486,12 +1787,12 @@
       <w:tr>
         <w:tc>
           <w:tcPr>
-            <w:tcW w:type="dxa" w:w="1820"/>
+            <w:tcW w:type="dxa" w:w="1760"/>
             <w:tcMar>
               <w:top w:w="80" w:type="dxa"/>
               <w:bottom w:w="80" w:type="dxa"/>
-              <w:start w:w="120" w:type="dxa"/>
-              <w:end w:w="120" w:type="dxa"/>
+              <w:start w:w="100" w:type="dxa"/>
+              <w:end w:w="100" w:type="dxa"/>
             </w:tcMar>
             <w:vAlign w:val="center"/>
           </w:tcPr>
@@ -1503,11 +1804,11 @@
             <w:r/>
             <w:r>
               <w:rPr>
-                <w:rFonts w:ascii="Calibri" w:hAnsi="Calibri"/>
+                <w:rFonts w:ascii="Times New Roman" w:hAnsi="Times New Roman"/>
                 <w:b w:val="0"/>
                 <w:i w:val="0"/>
-                <w:color w:val="212529"/>
-                <w:sz w:val="19"/>
+                <w:color w:val="000000"/>
+                <w:sz w:val="17"/>
               </w:rPr>
               <w:t>MPS signal</w:t>
             </w:r>
@@ -1515,12 +1816,12 @@
         </w:tc>
         <w:tc>
           <w:tcPr>
-            <w:tcW w:type="dxa" w:w="1400"/>
+            <w:tcW w:type="dxa" w:w="1380"/>
             <w:tcMar>
               <w:top w:w="80" w:type="dxa"/>
               <w:bottom w:w="80" w:type="dxa"/>
-              <w:start w:w="120" w:type="dxa"/>
-              <w:end w:w="120" w:type="dxa"/>
+              <w:start w:w="100" w:type="dxa"/>
+              <w:end w:w="100" w:type="dxa"/>
             </w:tcMar>
             <w:vAlign w:val="center"/>
           </w:tcPr>
@@ -1532,11 +1833,11 @@
             <w:r/>
             <w:r>
               <w:rPr>
-                <w:rFonts w:ascii="Calibri" w:hAnsi="Calibri"/>
+                <w:rFonts w:ascii="Times New Roman" w:hAnsi="Times New Roman"/>
                 <w:b w:val="0"/>
                 <w:i w:val="0"/>
-                <w:color w:val="212529"/>
-                <w:sz w:val="19"/>
+                <w:color w:val="000000"/>
+                <w:sz w:val="17"/>
               </w:rPr>
               <w:t>94.27%</w:t>
             </w:r>
@@ -1544,12 +1845,12 @@
         </w:tc>
         <w:tc>
           <w:tcPr>
-            <w:tcW w:type="dxa" w:w="1150"/>
+            <w:tcW w:type="dxa" w:w="1080"/>
             <w:tcMar>
               <w:top w:w="80" w:type="dxa"/>
               <w:bottom w:w="80" w:type="dxa"/>
-              <w:start w:w="120" w:type="dxa"/>
-              <w:end w:w="120" w:type="dxa"/>
+              <w:start w:w="100" w:type="dxa"/>
+              <w:end w:w="100" w:type="dxa"/>
             </w:tcMar>
             <w:vAlign w:val="center"/>
           </w:tcPr>
@@ -1561,11 +1862,11 @@
             <w:r/>
             <w:r>
               <w:rPr>
-                <w:rFonts w:ascii="Calibri" w:hAnsi="Calibri"/>
+                <w:rFonts w:ascii="Times New Roman" w:hAnsi="Times New Roman"/>
                 <w:b w:val="0"/>
                 <w:i w:val="0"/>
-                <w:color w:val="212529"/>
-                <w:sz w:val="19"/>
+                <w:color w:val="000000"/>
+                <w:sz w:val="17"/>
               </w:rPr>
               <w:t>0.694</w:t>
             </w:r>
@@ -1573,12 +1874,12 @@
         </w:tc>
         <w:tc>
           <w:tcPr>
-            <w:tcW w:type="dxa" w:w="1650"/>
+            <w:tcW w:type="dxa" w:w="1900"/>
             <w:tcMar>
               <w:top w:w="80" w:type="dxa"/>
               <w:bottom w:w="80" w:type="dxa"/>
-              <w:start w:w="120" w:type="dxa"/>
-              <w:end w:w="120" w:type="dxa"/>
+              <w:start w:w="100" w:type="dxa"/>
+              <w:end w:w="100" w:type="dxa"/>
             </w:tcMar>
             <w:vAlign w:val="center"/>
           </w:tcPr>
@@ -1590,11 +1891,11 @@
             <w:r/>
             <w:r>
               <w:rPr>
-                <w:rFonts w:ascii="Calibri" w:hAnsi="Calibri"/>
+                <w:rFonts w:ascii="Times New Roman" w:hAnsi="Times New Roman"/>
                 <w:b w:val="0"/>
                 <w:i w:val="0"/>
-                <w:color w:val="212529"/>
-                <w:sz w:val="19"/>
+                <w:color w:val="000000"/>
+                <w:sz w:val="17"/>
               </w:rPr>
               <w:t>-26.79%</w:t>
             </w:r>
@@ -1602,12 +1903,12 @@
         </w:tc>
         <w:tc>
           <w:tcPr>
-            <w:tcW w:type="dxa" w:w="1450"/>
+            <w:tcW w:type="dxa" w:w="1400"/>
             <w:tcMar>
               <w:top w:w="80" w:type="dxa"/>
               <w:bottom w:w="80" w:type="dxa"/>
-              <w:start w:w="120" w:type="dxa"/>
-              <w:end w:w="120" w:type="dxa"/>
+              <w:start w:w="100" w:type="dxa"/>
+              <w:end w:w="100" w:type="dxa"/>
             </w:tcMar>
             <w:vAlign w:val="center"/>
           </w:tcPr>
@@ -1619,11 +1920,11 @@
             <w:r/>
             <w:r>
               <w:rPr>
-                <w:rFonts w:ascii="Calibri" w:hAnsi="Calibri"/>
+                <w:rFonts w:ascii="Times New Roman" w:hAnsi="Times New Roman"/>
                 <w:b w:val="0"/>
                 <w:i w:val="0"/>
-                <w:color w:val="212529"/>
-                <w:sz w:val="19"/>
+                <w:color w:val="000000"/>
+                <w:sz w:val="17"/>
               </w:rPr>
               <w:t>24.14%</w:t>
             </w:r>
@@ -1631,12 +1932,12 @@
         </w:tc>
         <w:tc>
           <w:tcPr>
-            <w:tcW w:type="dxa" w:w="1890"/>
+            <w:tcW w:type="dxa" w:w="1840"/>
             <w:tcMar>
               <w:top w:w="80" w:type="dxa"/>
               <w:bottom w:w="80" w:type="dxa"/>
-              <w:start w:w="120" w:type="dxa"/>
-              <w:end w:w="120" w:type="dxa"/>
+              <w:start w:w="100" w:type="dxa"/>
+              <w:end w:w="100" w:type="dxa"/>
             </w:tcMar>
             <w:vAlign w:val="center"/>
           </w:tcPr>
@@ -1648,11 +1949,11 @@
             <w:r/>
             <w:r>
               <w:rPr>
-                <w:rFonts w:ascii="Calibri" w:hAnsi="Calibri"/>
+                <w:rFonts w:ascii="Times New Roman" w:hAnsi="Times New Roman"/>
                 <w:b w:val="0"/>
                 <w:i w:val="0"/>
-                <w:color w:val="212529"/>
-                <w:sz w:val="19"/>
+                <w:color w:val="000000"/>
+                <w:sz w:val="17"/>
               </w:rPr>
               <w:t>$1,253.61</w:t>
             </w:r>
@@ -1662,12 +1963,12 @@
       <w:tr>
         <w:tc>
           <w:tcPr>
-            <w:tcW w:type="dxa" w:w="1820"/>
+            <w:tcW w:type="dxa" w:w="1760"/>
             <w:tcMar>
               <w:top w:w="80" w:type="dxa"/>
               <w:bottom w:w="80" w:type="dxa"/>
-              <w:start w:w="120" w:type="dxa"/>
-              <w:end w:w="120" w:type="dxa"/>
+              <w:start w:w="100" w:type="dxa"/>
+              <w:end w:w="100" w:type="dxa"/>
             </w:tcMar>
             <w:vAlign w:val="center"/>
           </w:tcPr>
@@ -1679,11 +1980,11 @@
             <w:r/>
             <w:r>
               <w:rPr>
-                <w:rFonts w:ascii="Calibri" w:hAnsi="Calibri"/>
+                <w:rFonts w:ascii="Times New Roman" w:hAnsi="Times New Roman"/>
                 <w:b w:val="0"/>
                 <w:i w:val="0"/>
-                <w:color w:val="212529"/>
-                <w:sz w:val="19"/>
+                <w:color w:val="000000"/>
+                <w:sz w:val="17"/>
               </w:rPr>
               <w:t>Equal-weight</w:t>
             </w:r>
@@ -1691,12 +1992,12 @@
         </w:tc>
         <w:tc>
           <w:tcPr>
-            <w:tcW w:type="dxa" w:w="1400"/>
+            <w:tcW w:type="dxa" w:w="1380"/>
             <w:tcMar>
               <w:top w:w="80" w:type="dxa"/>
               <w:bottom w:w="80" w:type="dxa"/>
-              <w:start w:w="120" w:type="dxa"/>
-              <w:end w:w="120" w:type="dxa"/>
+              <w:start w:w="100" w:type="dxa"/>
+              <w:end w:w="100" w:type="dxa"/>
             </w:tcMar>
             <w:vAlign w:val="center"/>
           </w:tcPr>
@@ -1708,11 +2009,11 @@
             <w:r/>
             <w:r>
               <w:rPr>
-                <w:rFonts w:ascii="Calibri" w:hAnsi="Calibri"/>
+                <w:rFonts w:ascii="Times New Roman" w:hAnsi="Times New Roman"/>
                 <w:b w:val="0"/>
                 <w:i w:val="0"/>
-                <w:color w:val="212529"/>
-                <w:sz w:val="19"/>
+                <w:color w:val="000000"/>
+                <w:sz w:val="17"/>
               </w:rPr>
               <w:t>218.25%</w:t>
             </w:r>
@@ -1720,12 +2021,12 @@
         </w:tc>
         <w:tc>
           <w:tcPr>
-            <w:tcW w:type="dxa" w:w="1150"/>
+            <w:tcW w:type="dxa" w:w="1080"/>
             <w:tcMar>
               <w:top w:w="80" w:type="dxa"/>
               <w:bottom w:w="80" w:type="dxa"/>
-              <w:start w:w="120" w:type="dxa"/>
-              <w:end w:w="120" w:type="dxa"/>
+              <w:start w:w="100" w:type="dxa"/>
+              <w:end w:w="100" w:type="dxa"/>
             </w:tcMar>
             <w:vAlign w:val="center"/>
           </w:tcPr>
@@ -1737,11 +2038,11 @@
             <w:r/>
             <w:r>
               <w:rPr>
-                <w:rFonts w:ascii="Calibri" w:hAnsi="Calibri"/>
+                <w:rFonts w:ascii="Times New Roman" w:hAnsi="Times New Roman"/>
                 <w:b w:val="0"/>
                 <w:i w:val="0"/>
-                <w:color w:val="212529"/>
-                <w:sz w:val="19"/>
+                <w:color w:val="000000"/>
+                <w:sz w:val="17"/>
               </w:rPr>
               <w:t>1.115</w:t>
             </w:r>
@@ -1749,12 +2050,12 @@
         </w:tc>
         <w:tc>
           <w:tcPr>
-            <w:tcW w:type="dxa" w:w="1650"/>
+            <w:tcW w:type="dxa" w:w="1900"/>
             <w:tcMar>
               <w:top w:w="80" w:type="dxa"/>
               <w:bottom w:w="80" w:type="dxa"/>
-              <w:start w:w="120" w:type="dxa"/>
-              <w:end w:w="120" w:type="dxa"/>
+              <w:start w:w="100" w:type="dxa"/>
+              <w:end w:w="100" w:type="dxa"/>
             </w:tcMar>
             <w:vAlign w:val="center"/>
           </w:tcPr>
@@ -1766,11 +2067,11 @@
             <w:r/>
             <w:r>
               <w:rPr>
-                <w:rFonts w:ascii="Calibri" w:hAnsi="Calibri"/>
+                <w:rFonts w:ascii="Times New Roman" w:hAnsi="Times New Roman"/>
                 <w:b w:val="0"/>
                 <w:i w:val="0"/>
-                <w:color w:val="212529"/>
-                <w:sz w:val="19"/>
+                <w:color w:val="000000"/>
+                <w:sz w:val="17"/>
               </w:rPr>
               <w:t>-28.54%</w:t>
             </w:r>
@@ -1778,12 +2079,12 @@
         </w:tc>
         <w:tc>
           <w:tcPr>
-            <w:tcW w:type="dxa" w:w="1450"/>
+            <w:tcW w:type="dxa" w:w="1400"/>
             <w:tcMar>
               <w:top w:w="80" w:type="dxa"/>
               <w:bottom w:w="80" w:type="dxa"/>
-              <w:start w:w="120" w:type="dxa"/>
-              <w:end w:w="120" w:type="dxa"/>
+              <w:start w:w="100" w:type="dxa"/>
+              <w:end w:w="100" w:type="dxa"/>
             </w:tcMar>
             <w:vAlign w:val="center"/>
           </w:tcPr>
@@ -1795,11 +2096,11 @@
             <w:r/>
             <w:r>
               <w:rPr>
-                <w:rFonts w:ascii="Calibri" w:hAnsi="Calibri"/>
+                <w:rFonts w:ascii="Times New Roman" w:hAnsi="Times New Roman"/>
                 <w:b w:val="0"/>
                 <w:i w:val="0"/>
-                <w:color w:val="212529"/>
-                <w:sz w:val="19"/>
+                <w:color w:val="000000"/>
+                <w:sz w:val="17"/>
               </w:rPr>
               <w:t>20.06%</w:t>
             </w:r>
@@ -1807,12 +2108,12 @@
         </w:tc>
         <w:tc>
           <w:tcPr>
-            <w:tcW w:type="dxa" w:w="1890"/>
+            <w:tcW w:type="dxa" w:w="1840"/>
             <w:tcMar>
               <w:top w:w="80" w:type="dxa"/>
               <w:bottom w:w="80" w:type="dxa"/>
-              <w:start w:w="120" w:type="dxa"/>
-              <w:end w:w="120" w:type="dxa"/>
+              <w:start w:w="100" w:type="dxa"/>
+              <w:end w:w="100" w:type="dxa"/>
             </w:tcMar>
             <w:vAlign w:val="center"/>
           </w:tcPr>
@@ -1824,11 +2125,11 @@
             <w:r/>
             <w:r>
               <w:rPr>
-                <w:rFonts w:ascii="Calibri" w:hAnsi="Calibri"/>
+                <w:rFonts w:ascii="Times New Roman" w:hAnsi="Times New Roman"/>
                 <w:b w:val="0"/>
                 <w:i w:val="0"/>
-                <w:color w:val="212529"/>
-                <w:sz w:val="19"/>
+                <w:color w:val="000000"/>
+                <w:sz w:val="17"/>
               </w:rPr>
               <w:t>$1,000.00</w:t>
             </w:r>
@@ -1838,51 +2139,110 @@
     </w:tbl>
     <w:p>
       <w:pPr>
-        <w:spacing w:after="0"/>
+        <w:spacing w:after="0" w:line="120" w:lineRule="auto"/>
       </w:pPr>
     </w:p>
     <w:p>
       <w:pPr/>
       <w:r>
         <w:rPr>
-          <w:rFonts w:ascii="Calibri" w:hAnsi="Calibri"/>
+          <w:rFonts w:ascii="Times New Roman" w:hAnsi="Times New Roman"/>
           <w:b w:val="0"/>
           <w:i w:val="0"/>
-          <w:color w:val="212529"/>
-          <w:sz w:val="22"/>
+          <w:color w:val="000000"/>
+          <w:sz w:val="21"/>
         </w:rPr>
-        <w:t>The PPO values are means across three seeds. MPS had a lower Sharpe than ANN in every paired run: 0.759 versus 0.790 for seed 0, 0.726 versus 0.812 for seed 1, and 0.596 versus 0.602 for seed 2.</w:t>
+        <w:t>The PPO values are means across three seeds. MPS produced a lower Sharpe than ANN in every paired run: 0.759 compared with 0.790 for seed 0, 0.726 compared with 0.812 for seed 1, and 0.596 compared with 0.602 for seed 2. MPS traded less and had a slightly smaller mean drawdown, but it also produced lower return and risk-adjusted performance.</w:t>
+      </w:r>
+    </w:p>
+    <w:p>
+      <w:pPr>
+        <w:keepNext/>
+        <w:jc w:val="center"/>
+      </w:pPr>
+      <w:r>
+        <w:drawing>
+          <wp:inline xmlns:a="http://schemas.openxmlformats.org/drawingml/2006/main" xmlns:pic="http://schemas.openxmlformats.org/drawingml/2006/picture">
+            <wp:extent cx="5623560" cy="3067396"/>
+            <wp:docPr id="1" name="Picture 1" descr="Mean out-of-sample equity curves from 2019 through 2023 for Base FinRL, ANN signal, MPS signal, and equal-weight buy-and-hold. The equal-weight benchmark finishes highest, followed by ANN, MPS, and Base FinRL." title="Figure 1"/>
+            <wp:cNvGraphicFramePr>
+              <a:graphicFrameLocks noChangeAspect="1"/>
+            </wp:cNvGraphicFramePr>
+            <a:graphic>
+              <a:graphicData uri="http://schemas.openxmlformats.org/drawingml/2006/picture">
+                <pic:pic>
+                  <pic:nvPicPr>
+                    <pic:cNvPr id="0" name="equity_curves.png"/>
+                    <pic:cNvPicPr/>
+                  </pic:nvPicPr>
+                  <pic:blipFill>
+                    <a:blip r:embed="rId10"/>
+                    <a:stretch>
+                      <a:fillRect/>
+                    </a:stretch>
+                  </pic:blipFill>
+                  <pic:spPr>
+                    <a:xfrm>
+                      <a:off x="0" y="0"/>
+                      <a:ext cx="5623560" cy="3067396"/>
+                    </a:xfrm>
+                    <a:prstGeom prst="rect"/>
+                  </pic:spPr>
+                </pic:pic>
+              </a:graphicData>
+            </a:graphic>
+          </wp:inline>
+        </w:drawing>
+      </w:r>
+    </w:p>
+    <w:p>
+      <w:pPr>
+        <w:pStyle w:val="Caption"/>
+        <w:jc w:val="center"/>
+      </w:pPr>
+      <w:r>
+        <w:rPr>
+          <w:rFonts w:ascii="Times New Roman" w:hAnsi="Times New Roman"/>
+          <w:b w:val="0"/>
+          <w:i/>
+          <w:color w:val="000000"/>
+          <w:sz w:val="19"/>
+        </w:rPr>
+        <w:t>Figure 1. Mean out-of-sample equity curves. Shaded regions show variation across PPO seeds.</w:t>
+      </w:r>
+    </w:p>
+    <w:p>
+      <w:pPr>
+        <w:pStyle w:val="Heading2"/>
+      </w:pPr>
+      <w:r>
+        <w:t>3.3 Uncertainty and performance across years</w:t>
       </w:r>
     </w:p>
     <w:p>
       <w:pPr/>
       <w:r>
         <w:rPr>
-          <w:rFonts w:ascii="Calibri" w:hAnsi="Calibri"/>
+          <w:rFonts w:ascii="Times New Roman" w:hAnsi="Times New Roman"/>
           <w:b w:val="0"/>
           <w:i w:val="0"/>
-          <w:color w:val="212529"/>
-          <w:sz w:val="22"/>
+          <w:color w:val="000000"/>
+          <w:sz w:val="21"/>
         </w:rPr>
-        <w:t>Using a 20-trading-day block bootstrap with 2,000 samples, the MPS-minus-ANN annualized return difference was -0.92 percentage points. Its 95% interval was -4.63 to +2.63 points. Because that interval includes zero, this run does not show a reliable difference between the two signal agents.</w:t>
+        <w:t>Daily returns were averaged across seeds and evaluated with a moving 20-trading-day block bootstrap using 2,000 samples. The annualized return difference, MPS minus ANN, was -0.92 percentage points. The 95% interval was -4.63 to +2.63 percentage points, and the bootstrap probability that MPS exceeded ANN was 31.05%. Because the interval includes zero, the experiment does not establish a reliable difference between the two signal agents.</w:t>
       </w:r>
     </w:p>
     <w:p>
       <w:pPr/>
       <w:r>
         <w:rPr>
-          <w:rFonts w:ascii="Calibri" w:hAnsi="Calibri"/>
+          <w:rFonts w:ascii="Times New Roman" w:hAnsi="Times New Roman"/>
           <w:b w:val="0"/>
           <w:i w:val="0"/>
-          <w:color w:val="212529"/>
-          <w:sz w:val="22"/>
+          <w:color w:val="000000"/>
+          <w:sz w:val="21"/>
         </w:rPr>
-        <w:t>MPS beat ANN in 2020 and 2023, while ANN was better in 2019, 2021, and 2022. Neither signal agent beat the equal-weight benchmark over the full test period.</w:t>
-      </w:r>
-    </w:p>
-    <w:p>
-      <w:r>
-        <w:br w:type="page"/>
+        <w:t>The results also varied across calendar years. MPS outperformed ANN in 2020 and 2023, while ANN outperformed MPS in 2019, 2021, and 2022. Neither signal agent beat the equal-weight benchmark over the full test period.</w:t>
       </w:r>
     </w:p>
     <w:p>
@@ -1890,46 +2250,46 @@
         <w:pStyle w:val="Heading1"/>
       </w:pPr>
       <w:r>
-        <w:t>What I learned</w:t>
+        <w:t>4. Discussion</w:t>
       </w:r>
     </w:p>
     <w:p>
       <w:pPr/>
       <w:r>
         <w:rPr>
-          <w:rFonts w:ascii="Calibri" w:hAnsi="Calibri"/>
+          <w:rFonts w:ascii="Times New Roman" w:hAnsi="Times New Roman"/>
           <w:b w:val="0"/>
           <w:i w:val="0"/>
-          <w:color w:val="212529"/>
-          <w:sz w:val="22"/>
+          <w:color w:val="000000"/>
+          <w:sz w:val="21"/>
         </w:rPr>
-        <w:t>In this setup, the MPS signal did not improve trading performance over the equally sized ANN signal. It did slightly better on two prediction metrics, but the ANN produced a higher Sharpe in all three trading runs. This is the prediction-decision gap that motivated the study.</w:t>
+        <w:t>Under this dataset, time split, parameter budget, PPO configuration, and set of random seeds, the MPS signal did not improve trading performance relative to the ANN signal.</w:t>
       </w:r>
     </w:p>
     <w:p>
       <w:pPr/>
       <w:r>
         <w:rPr>
-          <w:rFonts w:ascii="Calibri" w:hAnsi="Calibri"/>
+          <w:rFonts w:ascii="Times New Roman" w:hAnsi="Times New Roman"/>
           <w:b w:val="0"/>
           <w:i w:val="0"/>
-          <w:color w:val="212529"/>
-          <w:sz w:val="22"/>
+          <w:color w:val="000000"/>
+          <w:sz w:val="21"/>
         </w:rPr>
-        <w:t>The result is limited to this experiment. I used one time split, three PPO seeds, one MPS bond dimension, and a relatively short 5,000-step training budget. The universe is also a 15-stock Nasdaq subset. The cost model includes a fixed transaction fee but not spread, slippage, market impact, or taxes.</w:t>
+        <w:t>The prediction and trading results should be considered separately. The MPS had slightly better MSE and directional accuracy, but the ANN agent produced a higher Sharpe ratio in each paired PPO run. A trading agent responds to a sequence of noisy predictions together with its portfolio state, costs, and earlier actions; a small improvement in one-step prediction is therefore not enough by itself to guarantee a better policy.</w:t>
       </w:r>
     </w:p>
     <w:p>
       <w:pPr/>
       <w:r>
         <w:rPr>
-          <w:rFonts w:ascii="Calibri" w:hAnsi="Calibri"/>
+          <w:rFonts w:ascii="Times New Roman" w:hAnsi="Times New Roman"/>
           <w:b w:val="0"/>
           <w:i w:val="0"/>
-          <w:color w:val="212529"/>
-          <w:sz w:val="22"/>
+          <w:color w:val="000000"/>
+          <w:sz w:val="21"/>
         </w:rPr>
-        <w:t>Trading activity became very low later in the test period, suggesting that some policies settled into nearly static positions. Before testing a tensor-network policy architecture, I would repeat the signal experiment with more seeds, longer PPO training, and rolling retraining periods.</w:t>
+        <w:t>None of the PPO agents beat the equal-weight buy-and-hold portfolio over this Nasdaq-heavy test period. The study therefore does not claim market-beating performance.</w:t>
       </w:r>
     </w:p>
     <w:p>
@@ -1937,43 +2297,79 @@
         <w:pStyle w:val="Heading1"/>
       </w:pPr>
       <w:r>
-        <w:t>Reproduction</w:t>
+        <w:t>5. Limitations and Next Step</w:t>
       </w:r>
     </w:p>
     <w:p>
       <w:pPr/>
       <w:r>
         <w:rPr>
-          <w:rFonts w:ascii="Calibri" w:hAnsi="Calibri"/>
+          <w:rFonts w:ascii="Times New Roman" w:hAnsi="Times New Roman"/>
           <w:b w:val="0"/>
           <w:i w:val="0"/>
-          <w:color w:val="212529"/>
-          <w:sz w:val="22"/>
+          <w:color w:val="000000"/>
+          <w:sz w:val="21"/>
         </w:rPr>
-        <w:t>The repository includes the full pipeline, tests, daily equity curves, per-seed and yearly metrics, bootstrap output, and a run manifest with the pinned data checksum and FinRL commit.</w:t>
+        <w:t>The study used a single historical split, three PPO seeds, one MPS bond dimension, and a 5,000-step PPO training budget. The 15-stock universe is small and not sector-neutral. Trading activity also became very low later in the test period, suggesting that some policies settled into nearly static positions.</w:t>
       </w:r>
     </w:p>
     <w:p>
       <w:pPr/>
       <w:r>
         <w:rPr>
-          <w:rFonts w:ascii="Calibri" w:hAnsi="Calibri"/>
+          <w:rFonts w:ascii="Times New Roman" w:hAnsi="Times New Roman"/>
+          <w:b w:val="0"/>
+          <w:i w:val="0"/>
+          <w:color w:val="000000"/>
+          <w:sz w:val="21"/>
+        </w:rPr>
+        <w:t>Before testing a tensor-network policy architecture, I would strengthen this baseline with more random seeds, a longer PPO training budget, and rolling or expanding-window retraining. A policy-level comparison would then be easier to interpret.</w:t>
+      </w:r>
+    </w:p>
+    <w:p>
+      <w:pPr>
+        <w:pStyle w:val="Heading1"/>
+      </w:pPr>
+      <w:r>
+        <w:t>6. Reproducibility</w:t>
+      </w:r>
+    </w:p>
+    <w:p>
+      <w:pPr/>
+      <w:r>
+        <w:rPr>
+          <w:rFonts w:ascii="Times New Roman" w:hAnsi="Times New Roman"/>
+          <w:b w:val="0"/>
+          <w:i w:val="0"/>
+          <w:color w:val="000000"/>
+          <w:sz w:val="21"/>
+        </w:rPr>
+        <w:t>The repository contains the experiment pipeline, integrity tests, daily equity curves, per-seed metrics, calendar-year results, bootstrap output, and a run manifest with the dataset checksum, FinRL commit, configuration, and known limitations.</w:t>
+      </w:r>
+    </w:p>
+    <w:p>
+      <w:pPr>
+        <w:spacing w:after="140"/>
+      </w:pPr>
+      <w:r>
+        <w:rPr>
+          <w:rFonts w:ascii="Times New Roman" w:hAnsi="Times New Roman"/>
           <w:b/>
           <w:i w:val="0"/>
-          <w:color w:val="212529"/>
-          <w:sz w:val="22"/>
+          <w:color w:val="000000"/>
+          <w:sz w:val="21"/>
         </w:rPr>
-        <w:t>Repository:</w:t>
+        <w:t xml:space="preserve">Repository: </w:t>
       </w:r>
       <w:r>
         <w:rPr>
-          <w:rFonts w:ascii="Calibri" w:hAnsi="Calibri"/>
+          <w:rFonts w:ascii="Times New Roman" w:hAnsi="Times New Roman"/>
           <w:b w:val="0"/>
           <w:i w:val="0"/>
-          <w:color w:val="212529"/>
-          <w:sz w:val="22"/>
+          <w:color w:val="000000"/>
+          <w:sz w:val="21"/>
         </w:rPr>
-        <w:t xml:space="preserve"> https://github.com/Aarav-Nagar/QINN-FinRL-Evaluation</w:t>
+        <w:t>https://github.com/Aarav-Nagar/QINN-FinRL-Evaluation</w:t>
       </w:r>
     </w:p>
     <w:p>
@@ -1986,73 +2382,104 @@
     </w:p>
     <w:p>
       <w:pPr>
-        <w:spacing w:after="60"/>
-        <w:ind w:left="259" w:hanging="259"/>
+        <w:spacing w:after="60" w:line="240" w:lineRule="auto"/>
+        <w:ind w:left="360" w:hanging="360"/>
       </w:pPr>
       <w:r>
         <w:rPr>
-          <w:rFonts w:ascii="Calibri" w:hAnsi="Calibri"/>
+          <w:rFonts w:ascii="Times New Roman" w:hAnsi="Times New Roman"/>
           <w:b w:val="0"/>
           <w:i w:val="0"/>
-          <w:color w:val="212529"/>
-          <w:sz w:val="19"/>
+          <w:color w:val="000000"/>
+          <w:sz w:val="18"/>
         </w:rPr>
-        <w:t>1. Biamonte, J. et al. “Quantum Machine Learning.” Nature 549, 195-202 (2017).</w:t>
+        <w:t>1. Biamonte, J., et al. “Quantum Machine Learning.” Nature, vol. 549, 2017, pp. 195-202.</w:t>
       </w:r>
     </w:p>
     <w:p>
       <w:pPr>
-        <w:spacing w:after="60"/>
-        <w:ind w:left="259" w:hanging="259"/>
+        <w:spacing w:after="60" w:line="240" w:lineRule="auto"/>
+        <w:ind w:left="360" w:hanging="360"/>
       </w:pPr>
       <w:r>
         <w:rPr>
-          <w:rFonts w:ascii="Calibri" w:hAnsi="Calibri"/>
+          <w:rFonts w:ascii="Times New Roman" w:hAnsi="Times New Roman"/>
           <w:b w:val="0"/>
           <w:i w:val="0"/>
-          <w:color w:val="212529"/>
-          <w:sz w:val="19"/>
+          <w:color w:val="000000"/>
+          <w:sz w:val="18"/>
         </w:rPr>
-        <w:t>2. Liu, X.-Y. and Fang, Y. “Quantum Tensor Networks for Variational Reinforcement Learning.” NeurIPS 2020 workshop.</w:t>
+        <w:t>2. Liu, X.-Y., and Y. Fang. “Quantum Tensor Networks for Variational Reinforcement Learning.” NeurIPS 2020 Quantum Tensor Networks in Machine Learning Workshop.</w:t>
       </w:r>
     </w:p>
     <w:p>
       <w:pPr>
-        <w:spacing w:after="60"/>
-        <w:ind w:left="259" w:hanging="259"/>
+        <w:spacing w:after="60" w:line="240" w:lineRule="auto"/>
+        <w:ind w:left="360" w:hanging="360"/>
       </w:pPr>
       <w:r>
         <w:rPr>
-          <w:rFonts w:ascii="Calibri" w:hAnsi="Calibri"/>
+          <w:rFonts w:ascii="Times New Roman" w:hAnsi="Times New Roman"/>
           <w:b w:val="0"/>
           <w:i w:val="0"/>
-          <w:color w:val="212529"/>
-          <w:sz w:val="19"/>
+          <w:color w:val="000000"/>
+          <w:sz w:val="18"/>
         </w:rPr>
-        <w:t>3. FinRL Contest 2025, Task 1: FinRL-DeepSeek for Stock Trading.</w:t>
+        <w:t>3. NeurIPS 2020 Quantum Tensor Networks in Machine Learning Workshop. https://tensorworkshop.github.io/NeurIPS2020/accepted_papers.html</w:t>
       </w:r>
     </w:p>
     <w:p>
       <w:pPr>
-        <w:spacing w:after="60"/>
-        <w:ind w:left="259" w:hanging="259"/>
+        <w:spacing w:after="60" w:line="240" w:lineRule="auto"/>
+        <w:ind w:left="360" w:hanging="360"/>
       </w:pPr>
       <w:r>
         <w:rPr>
-          <w:rFonts w:ascii="Calibri" w:hAnsi="Calibri"/>
+          <w:rFonts w:ascii="Times New Roman" w:hAnsi="Times New Roman"/>
           <w:b w:val="0"/>
           <w:i w:val="0"/>
-          <w:color w:val="212529"/>
-          <w:sz w:val="19"/>
+          <w:color w:val="000000"/>
+          <w:sz w:val="18"/>
         </w:rPr>
-        <w:t>4. FinRL commit used here: 2334a5fe6d30629157f13c3b0319e1637e15e123.</w:t>
+        <w:t>4. NeurIPS 2021 Quantum Tensor Networks in Machine Learning Workshop. https://tensorworkshop.github.io/NeurIPS2021/accepted_papers.html</w:t>
+      </w:r>
+    </w:p>
+    <w:p>
+      <w:pPr>
+        <w:spacing w:after="60" w:line="240" w:lineRule="auto"/>
+        <w:ind w:left="360" w:hanging="360"/>
+      </w:pPr>
+      <w:r>
+        <w:rPr>
+          <w:rFonts w:ascii="Times New Roman" w:hAnsi="Times New Roman"/>
+          <w:b w:val="0"/>
+          <w:i w:val="0"/>
+          <w:color w:val="000000"/>
+          <w:sz w:val="18"/>
+        </w:rPr>
+        <w:t>5. FinRL Contest 2025. “Task 1: FinRL-DeepSeek for Stock Trading.” https://finrl-contest.readthedocs.io/en/latest/finrl2025/task1.html</w:t>
+      </w:r>
+    </w:p>
+    <w:p>
+      <w:pPr>
+        <w:spacing w:after="60" w:line="240" w:lineRule="auto"/>
+        <w:ind w:left="360" w:hanging="360"/>
+      </w:pPr>
+      <w:r>
+        <w:rPr>
+          <w:rFonts w:ascii="Times New Roman" w:hAnsi="Times New Roman"/>
+          <w:b w:val="0"/>
+          <w:i w:val="0"/>
+          <w:color w:val="000000"/>
+          <w:sz w:val="18"/>
+        </w:rPr>
+        <w:t>6. AI4Finance Foundation. FinRL. Commit 2334a5fe6d30629157f13c3b0319e1637e15e123.</w:t>
       </w:r>
     </w:p>
     <w:sectPr>
-      <w:headerReference w:type="default" r:id="rId9"/>
-      <w:footerReference w:type="default" r:id="rId10"/>
+      <w:footerReference w:type="default" r:id="rId9"/>
       <w:pgSz w:w="12240" w:h="15840"/>
-      <w:pgMar w:top="1440" w:right="1440" w:bottom="1440" w:left="1440" w:header="708" w:footer="708" w:gutter="0"/>
+      <w:pgMar w:top="1296" w:right="1440" w:bottom="1224" w:left="1440" w:header="504" w:footer="576" w:gutter="0"/>
       <w:cols w:space="720"/>
       <w:docGrid w:linePitch="360"/>
     </w:sectPr>
@@ -2065,24 +2492,14 @@
   <w:p>
     <w:pPr>
       <w:pStyle w:val="Footer"/>
-      <w:jc w:val="right"/>
+      <w:jc w:val="center"/>
     </w:pPr>
     <w:r>
       <w:rPr>
-        <w:rFonts w:ascii="Calibri" w:hAnsi="Calibri"/>
+        <w:rFonts w:ascii="Times New Roman" w:hAnsi="Times New Roman"/>
         <w:b w:val="0"/>
         <w:i w:val="0"/>
-        <w:color w:val="595959"/>
-        <w:sz w:val="18"/>
-      </w:rPr>
-      <w:t xml:space="preserve">Page </w:t>
-    </w:r>
-    <w:r>
-      <w:rPr>
-        <w:rFonts w:ascii="Calibri" w:hAnsi="Calibri"/>
-        <w:b w:val="0"/>
-        <w:i w:val="0"/>
-        <w:color w:val="595959"/>
+        <w:color w:val="000000"/>
         <w:sz w:val="18"/>
       </w:rPr>
       <w:fldChar w:fldCharType="begin"/>
@@ -2093,27 +2510,6 @@
     </w:r>
   </w:p>
 </w:ftr>
-</file>
-
-<file path=word/header1.xml><?xml version="1.0" encoding="utf-8"?>
-<w:hdr xmlns:m="http://schemas.openxmlformats.org/officeDocument/2006/math" xmlns:mc="http://schemas.openxmlformats.org/markup-compatibility/2006" xmlns:mo="http://schemas.microsoft.com/office/mac/office/2008/main" xmlns:mv="urn:schemas-microsoft-com:mac:vml" xmlns:o="urn:schemas-microsoft-com:office:office" xmlns:r="http://schemas.openxmlformats.org/officeDocument/2006/relationships" xmlns:v="urn:schemas-microsoft-com:vml" xmlns:w10="urn:schemas-microsoft-com:office:word" xmlns:w14="http://schemas.microsoft.com/office/word/2010/wordml" xmlns:w="http://schemas.openxmlformats.org/wordprocessingml/2006/main" xmlns:wne="http://schemas.microsoft.com/office/word/2006/wordml" xmlns:wp14="http://schemas.microsoft.com/office/word/2010/wordprocessingDrawing" xmlns:wp="http://schemas.openxmlformats.org/drawingml/2006/wordprocessingDrawing" xmlns:wpc="http://schemas.microsoft.com/office/word/2010/wordprocessingCanvas" xmlns:wpg="http://schemas.microsoft.com/office/word/2010/wordprocessingGroup" xmlns:wpi="http://schemas.microsoft.com/office/word/2010/wordprocessingInk" xmlns:wps="http://schemas.microsoft.com/office/word/2010/wordprocessingShape" mc:Ignorable="w14 wp14">
-  <w:p>
-    <w:pPr>
-      <w:pStyle w:val="Header"/>
-      <w:jc w:val="left"/>
-    </w:pPr>
-    <w:r>
-      <w:rPr>
-        <w:rFonts w:ascii="Calibri" w:hAnsi="Calibri"/>
-        <w:b w:val="0"/>
-        <w:i w:val="0"/>
-        <w:color w:val="595959"/>
-        <w:sz w:val="18"/>
-      </w:rPr>
-      <w:t>ANN and MPS signals in FinRL</w:t>
-    </w:r>
-  </w:p>
-</w:hdr>
 </file>
 
 <file path=word/numbering.xml><?xml version="1.0" encoding="utf-8"?>
@@ -2480,12 +2876,13 @@
     <w:qFormat/>
     <w:rsid w:val="00FC693F"/>
     <w:pPr>
-      <w:spacing w:before="0" w:after="120" w:line="264" w:lineRule="auto"/>
+      <w:spacing w:before="0" w:after="100" w:line="276" w:lineRule="auto"/>
+      <w:jc w:val="both"/>
     </w:pPr>
     <w:rPr>
-      <w:rFonts w:ascii="Calibri" w:hAnsi="Calibri"/>
-      <w:color w:val="212529"/>
-      <w:sz w:val="22"/>
+      <w:rFonts w:ascii="Times New Roman" w:hAnsi="Times New Roman"/>
+      <w:color w:val="000000"/>
+      <w:sz w:val="21"/>
     </w:rPr>
   </w:style>
   <w:style w:type="paragraph" w:styleId="Header">
@@ -2543,15 +2940,15 @@
     <w:pPr>
       <w:keepNext/>
       <w:keepLines/>
-      <w:spacing w:before="320" w:after="160"/>
+      <w:spacing w:before="240" w:after="100"/>
       <w:outlineLvl w:val="0"/>
     </w:pPr>
     <w:rPr>
-      <w:rFonts w:asciiTheme="majorHAnsi" w:eastAsiaTheme="majorEastAsia" w:hAnsiTheme="majorHAnsi" w:cstheme="majorBidi" w:ascii="Calibri" w:hAnsi="Calibri"/>
+      <w:rFonts w:asciiTheme="majorHAnsi" w:eastAsiaTheme="majorEastAsia" w:hAnsiTheme="majorHAnsi" w:cstheme="majorBidi" w:ascii="Times New Roman" w:hAnsi="Times New Roman"/>
       <w:b/>
       <w:bCs/>
-      <w:color w:val="2E74B5"/>
-      <w:sz w:val="32"/>
+      <w:color w:val="000000"/>
+      <w:sz w:val="24"/>
       <w:szCs w:val="28"/>
     </w:rPr>
   </w:style>
@@ -2567,15 +2964,15 @@
     <w:pPr>
       <w:keepNext/>
       <w:keepLines/>
-      <w:spacing w:before="240" w:after="120"/>
+      <w:spacing w:before="180" w:after="80"/>
       <w:outlineLvl w:val="1"/>
     </w:pPr>
     <w:rPr>
-      <w:rFonts w:asciiTheme="majorHAnsi" w:eastAsiaTheme="majorEastAsia" w:hAnsiTheme="majorHAnsi" w:cstheme="majorBidi" w:ascii="Calibri" w:hAnsi="Calibri"/>
+      <w:rFonts w:asciiTheme="majorHAnsi" w:eastAsiaTheme="majorEastAsia" w:hAnsiTheme="majorHAnsi" w:cstheme="majorBidi" w:ascii="Times New Roman" w:hAnsi="Times New Roman"/>
       <w:b/>
       <w:bCs/>
-      <w:color w:val="2E74B5"/>
-      <w:sz w:val="26"/>
+      <w:color w:val="000000"/>
+      <w:sz w:val="22"/>
       <w:szCs w:val="26"/>
     </w:rPr>
   </w:style>
@@ -2591,15 +2988,15 @@
     <w:pPr>
       <w:keepNext/>
       <w:keepLines/>
-      <w:spacing w:before="160" w:after="80"/>
+      <w:spacing w:before="140" w:after="60"/>
       <w:outlineLvl w:val="2"/>
     </w:pPr>
     <w:rPr>
-      <w:rFonts w:asciiTheme="majorHAnsi" w:eastAsiaTheme="majorEastAsia" w:hAnsiTheme="majorHAnsi" w:cstheme="majorBidi" w:ascii="Calibri" w:hAnsi="Calibri"/>
+      <w:rFonts w:asciiTheme="majorHAnsi" w:eastAsiaTheme="majorEastAsia" w:hAnsiTheme="majorHAnsi" w:cstheme="majorBidi" w:ascii="Times New Roman" w:hAnsi="Times New Roman"/>
       <w:b/>
       <w:bCs/>
-      <w:color w:val="1F4D78"/>
-      <w:sz w:val="24"/>
+      <w:color w:val="000000"/>
+      <w:sz w:val="21"/>
     </w:rPr>
   </w:style>
   <w:style w:type="paragraph" w:styleId="Heading4">
@@ -3276,13 +3673,16 @@
     <w:qFormat/>
     <w:rsid w:val="00FC693F"/>
     <w:pPr>
-      <w:spacing w:line="240" w:lineRule="auto"/>
+      <w:keepNext/>
+      <w:spacing w:line="240" w:lineRule="auto" w:before="80" w:after="60"/>
     </w:pPr>
     <w:rPr>
+      <w:rFonts w:ascii="Times New Roman" w:hAnsi="Times New Roman"/>
       <w:b/>
       <w:bCs/>
-      <w:color w:val="4F81BD" w:themeColor="accent1"/>
-      <w:sz w:val="18"/>
+      <w:i/>
+      <w:color w:val="000000"/>
+      <w:sz w:val="19"/>
       <w:szCs w:val="18"/>
     </w:rPr>
   </w:style>

</xml_diff>